<commit_message>
Backend - listening ports and add created with environmental variable
</commit_message>
<xml_diff>
--- a/doc/Ecommerce.docx
+++ b/doc/Ecommerce.docx
@@ -11,8 +11,8 @@
           <w:bCs/>
           <w:i/>
           <w:iCs/>
-          <w:sz w:val="72"/>
-          <w:szCs w:val="72"/>
+          <w:sz w:val="44"/>
+          <w:szCs w:val="44"/>
           <w:lang w:val="en-US"/>
         </w:rPr>
       </w:pPr>
@@ -23,8 +23,8 @@
           <w:bCs/>
           <w:i/>
           <w:iCs/>
-          <w:sz w:val="72"/>
-          <w:szCs w:val="72"/>
+          <w:sz w:val="44"/>
+          <w:szCs w:val="44"/>
           <w:lang w:val="en-US"/>
         </w:rPr>
         <w:t>E-Commerce Site</w:t>
@@ -41,16 +41,16 @@
           <w:rFonts w:cstheme="minorHAnsi"/>
           <w:b/>
           <w:bCs/>
-          <w:sz w:val="40"/>
-          <w:szCs w:val="40"/>
-          <w:lang w:val="en-US"/>
-        </w:rPr>
-      </w:pPr>
-      <w:r>
-        <w:rPr>
-          <w:rFonts w:cstheme="minorHAnsi"/>
-          <w:sz w:val="40"/>
-          <w:szCs w:val="40"/>
+          <w:sz w:val="28"/>
+          <w:szCs w:val="28"/>
+          <w:lang w:val="en-US"/>
+        </w:rPr>
+      </w:pPr>
+      <w:r>
+        <w:rPr>
+          <w:rFonts w:cstheme="minorHAnsi"/>
+          <w:sz w:val="28"/>
+          <w:szCs w:val="28"/>
           <w:lang w:val="en-US"/>
         </w:rPr>
         <w:t>Create Workspace – Ecommerce.</w:t>
@@ -62,8 +62,8 @@
           <w:rFonts w:ascii="Algerian" w:hAnsi="Algerian" w:cstheme="minorHAnsi"/>
           <w:b/>
           <w:bCs/>
-          <w:sz w:val="48"/>
-          <w:szCs w:val="48"/>
+          <w:sz w:val="36"/>
+          <w:szCs w:val="36"/>
           <w:u w:val="single"/>
           <w:lang w:val="en-US"/>
         </w:rPr>
@@ -73,8 +73,8 @@
           <w:rFonts w:ascii="Algerian" w:hAnsi="Algerian" w:cstheme="minorHAnsi"/>
           <w:b/>
           <w:bCs/>
-          <w:sz w:val="48"/>
-          <w:szCs w:val="48"/>
+          <w:sz w:val="36"/>
+          <w:szCs w:val="36"/>
           <w:u w:val="single"/>
           <w:lang w:val="en-US"/>
         </w:rPr>
@@ -86,134 +86,14 @@
         <w:pStyle w:val="ListParagraph"/>
         <w:numPr>
           <w:ilvl w:val="0"/>
-          <w:numId w:val="4"/>
-        </w:numPr>
-        <w:rPr>
-          <w:rFonts w:cstheme="minorHAnsi"/>
-          <w:sz w:val="40"/>
-          <w:szCs w:val="40"/>
-          <w:lang w:val="en-US"/>
-        </w:rPr>
-      </w:pPr>
-      <w:r>
-        <w:rPr>
-          <w:rFonts w:cstheme="minorHAnsi"/>
-          <w:sz w:val="40"/>
-          <w:szCs w:val="40"/>
-          <w:lang w:val="en-US"/>
-        </w:rPr>
-        <w:t xml:space="preserve">To initialize git – git </w:t>
-      </w:r>
-      <w:proofErr w:type="spellStart"/>
-      <w:r>
-        <w:rPr>
-          <w:rFonts w:cstheme="minorHAnsi"/>
-          <w:sz w:val="40"/>
-          <w:szCs w:val="40"/>
-          <w:lang w:val="en-US"/>
-        </w:rPr>
-        <w:t>init</w:t>
-      </w:r>
-      <w:proofErr w:type="spellEnd"/>
-    </w:p>
-    <w:p>
-      <w:pPr>
-        <w:pStyle w:val="ListParagraph"/>
-        <w:numPr>
-          <w:ilvl w:val="0"/>
-          <w:numId w:val="4"/>
-        </w:numPr>
-        <w:rPr>
-          <w:rFonts w:cstheme="minorHAnsi"/>
-          <w:sz w:val="40"/>
-          <w:szCs w:val="40"/>
-          <w:lang w:val="en-US"/>
-        </w:rPr>
-      </w:pPr>
-      <w:r>
-        <w:rPr>
-          <w:rFonts w:cstheme="minorHAnsi"/>
-          <w:sz w:val="40"/>
-          <w:szCs w:val="40"/>
-          <w:lang w:val="en-US"/>
-        </w:rPr>
-        <w:t xml:space="preserve">We don’t need node modules so add node modules </w:t>
-      </w:r>
-      <w:proofErr w:type="gramStart"/>
-      <w:r>
-        <w:rPr>
-          <w:rFonts w:cstheme="minorHAnsi"/>
-          <w:sz w:val="40"/>
-          <w:szCs w:val="40"/>
-          <w:lang w:val="en-US"/>
-        </w:rPr>
-        <w:t>to .</w:t>
-      </w:r>
-      <w:proofErr w:type="spellStart"/>
-      <w:r>
-        <w:rPr>
-          <w:rFonts w:cstheme="minorHAnsi"/>
-          <w:sz w:val="40"/>
-          <w:szCs w:val="40"/>
-          <w:lang w:val="en-US"/>
-        </w:rPr>
-        <w:t>gitignore</w:t>
-      </w:r>
-      <w:proofErr w:type="spellEnd"/>
-      <w:proofErr w:type="gramEnd"/>
-      <w:r>
-        <w:rPr>
-          <w:rFonts w:cstheme="minorHAnsi"/>
-          <w:sz w:val="40"/>
-          <w:szCs w:val="40"/>
-          <w:lang w:val="en-US"/>
-        </w:rPr>
-        <w:t xml:space="preserve"> using </w:t>
-      </w:r>
-    </w:p>
-    <w:p>
-      <w:pPr>
-        <w:pStyle w:val="ListParagraph"/>
-        <w:numPr>
-          <w:ilvl w:val="0"/>
-          <w:numId w:val="4"/>
-        </w:numPr>
-        <w:rPr>
-          <w:rFonts w:cstheme="minorHAnsi"/>
-          <w:sz w:val="40"/>
-          <w:szCs w:val="40"/>
-          <w:lang w:val="en-US"/>
-        </w:rPr>
-      </w:pPr>
-      <w:r>
-        <w:rPr>
-          <w:rFonts w:cstheme="minorHAnsi"/>
-          <w:sz w:val="40"/>
-          <w:szCs w:val="40"/>
-          <w:lang w:val="en-US"/>
-        </w:rPr>
-        <w:t xml:space="preserve">Then add files to commit – git </w:t>
-      </w:r>
-      <w:proofErr w:type="gramStart"/>
-      <w:r>
-        <w:rPr>
-          <w:rFonts w:cstheme="minorHAnsi"/>
-          <w:sz w:val="40"/>
-          <w:szCs w:val="40"/>
-          <w:lang w:val="en-US"/>
-        </w:rPr>
-        <w:t>add .</w:t>
-      </w:r>
-      <w:proofErr w:type="gramEnd"/>
-    </w:p>
-    <w:p>
-      <w:pPr>
+          <w:numId w:val="5"/>
+        </w:numPr>
         <w:rPr>
           <w:rFonts w:ascii="Algerian" w:hAnsi="Algerian" w:cstheme="minorHAnsi"/>
           <w:b/>
           <w:bCs/>
-          <w:sz w:val="48"/>
-          <w:szCs w:val="48"/>
+          <w:sz w:val="32"/>
+          <w:szCs w:val="32"/>
           <w:u w:val="single"/>
           <w:lang w:val="en-US"/>
         </w:rPr>
@@ -223,8 +103,518 @@
           <w:rFonts w:ascii="Algerian" w:hAnsi="Algerian" w:cstheme="minorHAnsi"/>
           <w:b/>
           <w:bCs/>
-          <w:sz w:val="48"/>
-          <w:szCs w:val="48"/>
+          <w:sz w:val="32"/>
+          <w:szCs w:val="32"/>
+          <w:u w:val="single"/>
+          <w:lang w:val="en-US"/>
+        </w:rPr>
+        <w:t>Using VS-Code:</w:t>
+      </w:r>
+    </w:p>
+    <w:p>
+      <w:pPr>
+        <w:pStyle w:val="ListParagraph"/>
+        <w:numPr>
+          <w:ilvl w:val="0"/>
+          <w:numId w:val="6"/>
+        </w:numPr>
+        <w:rPr>
+          <w:rFonts w:cstheme="minorHAnsi"/>
+          <w:sz w:val="28"/>
+          <w:szCs w:val="28"/>
+          <w:lang w:val="en-US"/>
+        </w:rPr>
+      </w:pPr>
+      <w:r>
+        <w:rPr>
+          <w:rFonts w:cstheme="minorHAnsi"/>
+          <w:sz w:val="28"/>
+          <w:szCs w:val="28"/>
+          <w:lang w:val="en-US"/>
+        </w:rPr>
+        <w:t>To initialize git – git init</w:t>
+      </w:r>
+    </w:p>
+    <w:p>
+      <w:pPr>
+        <w:pStyle w:val="ListParagraph"/>
+        <w:numPr>
+          <w:ilvl w:val="0"/>
+          <w:numId w:val="6"/>
+        </w:numPr>
+        <w:rPr>
+          <w:rFonts w:cstheme="minorHAnsi"/>
+          <w:sz w:val="28"/>
+          <w:szCs w:val="28"/>
+          <w:lang w:val="en-US"/>
+        </w:rPr>
+      </w:pPr>
+      <w:r>
+        <w:rPr>
+          <w:rFonts w:cstheme="minorHAnsi"/>
+          <w:sz w:val="28"/>
+          <w:szCs w:val="28"/>
+          <w:lang w:val="en-US"/>
+        </w:rPr>
+        <w:t xml:space="preserve">We don’t need node modules so add node modules to .gitignore using </w:t>
+      </w:r>
+    </w:p>
+    <w:p>
+      <w:pPr>
+        <w:pStyle w:val="ListParagraph"/>
+        <w:numPr>
+          <w:ilvl w:val="0"/>
+          <w:numId w:val="6"/>
+        </w:numPr>
+        <w:rPr>
+          <w:rFonts w:cstheme="minorHAnsi"/>
+          <w:sz w:val="28"/>
+          <w:szCs w:val="28"/>
+          <w:lang w:val="en-US"/>
+        </w:rPr>
+      </w:pPr>
+      <w:r>
+        <w:rPr>
+          <w:rFonts w:cstheme="minorHAnsi"/>
+          <w:sz w:val="28"/>
+          <w:szCs w:val="28"/>
+          <w:lang w:val="en-US"/>
+        </w:rPr>
+        <w:t>Then add files to commit the files– git add .</w:t>
+      </w:r>
+    </w:p>
+    <w:p>
+      <w:pPr>
+        <w:pStyle w:val="ListParagraph"/>
+        <w:numPr>
+          <w:ilvl w:val="0"/>
+          <w:numId w:val="6"/>
+        </w:numPr>
+        <w:rPr>
+          <w:rFonts w:cstheme="minorHAnsi"/>
+          <w:sz w:val="28"/>
+          <w:szCs w:val="28"/>
+          <w:lang w:val="en-US"/>
+        </w:rPr>
+      </w:pPr>
+      <w:r>
+        <w:rPr>
+          <w:rFonts w:cstheme="minorHAnsi"/>
+          <w:sz w:val="28"/>
+          <w:szCs w:val="28"/>
+          <w:lang w:val="en-US"/>
+        </w:rPr>
+        <w:t>To check the status – git status.</w:t>
+      </w:r>
+    </w:p>
+    <w:p>
+      <w:pPr>
+        <w:pStyle w:val="ListParagraph"/>
+        <w:numPr>
+          <w:ilvl w:val="0"/>
+          <w:numId w:val="6"/>
+        </w:numPr>
+        <w:rPr>
+          <w:rFonts w:cstheme="minorHAnsi"/>
+          <w:sz w:val="28"/>
+          <w:szCs w:val="28"/>
+          <w:lang w:val="en-US"/>
+        </w:rPr>
+      </w:pPr>
+      <w:r>
+        <w:rPr>
+          <w:rFonts w:cstheme="minorHAnsi"/>
+          <w:sz w:val="28"/>
+          <w:szCs w:val="28"/>
+          <w:lang w:val="en-US"/>
+        </w:rPr>
+        <w:t>To commit the files – git commit -m “message”.</w:t>
+      </w:r>
+    </w:p>
+    <w:p>
+      <w:pPr>
+        <w:pStyle w:val="ListParagraph"/>
+        <w:numPr>
+          <w:ilvl w:val="0"/>
+          <w:numId w:val="6"/>
+        </w:numPr>
+        <w:rPr>
+          <w:rFonts w:cstheme="minorHAnsi"/>
+          <w:sz w:val="28"/>
+          <w:szCs w:val="28"/>
+          <w:lang w:val="en-US"/>
+        </w:rPr>
+      </w:pPr>
+      <w:r>
+        <w:rPr>
+          <w:rFonts w:cstheme="minorHAnsi"/>
+          <w:sz w:val="28"/>
+          <w:szCs w:val="28"/>
+          <w:lang w:val="en-US"/>
+        </w:rPr>
+        <w:t>Then pusblish using vs-code.</w:t>
+      </w:r>
+    </w:p>
+    <w:p>
+      <w:pPr>
+        <w:pStyle w:val="ListParagraph"/>
+        <w:numPr>
+          <w:ilvl w:val="0"/>
+          <w:numId w:val="6"/>
+        </w:numPr>
+        <w:rPr>
+          <w:rFonts w:cstheme="minorHAnsi"/>
+          <w:sz w:val="28"/>
+          <w:szCs w:val="28"/>
+          <w:lang w:val="en-US"/>
+        </w:rPr>
+      </w:pPr>
+      <w:r>
+        <w:rPr>
+          <w:rFonts w:cstheme="minorHAnsi"/>
+          <w:sz w:val="28"/>
+          <w:szCs w:val="28"/>
+          <w:lang w:val="en-US"/>
+        </w:rPr>
+        <w:t>To create branch – git branch branchname.</w:t>
+      </w:r>
+    </w:p>
+    <w:p>
+      <w:pPr>
+        <w:pStyle w:val="ListParagraph"/>
+        <w:numPr>
+          <w:ilvl w:val="0"/>
+          <w:numId w:val="5"/>
+        </w:numPr>
+        <w:rPr>
+          <w:rFonts w:ascii="Algerian" w:hAnsi="Algerian" w:cstheme="minorHAnsi"/>
+          <w:b/>
+          <w:bCs/>
+          <w:sz w:val="32"/>
+          <w:szCs w:val="32"/>
+          <w:u w:val="single"/>
+          <w:lang w:val="en-US"/>
+        </w:rPr>
+      </w:pPr>
+      <w:r>
+        <w:rPr>
+          <w:rFonts w:ascii="Algerian" w:hAnsi="Algerian" w:cstheme="minorHAnsi"/>
+          <w:b/>
+          <w:bCs/>
+          <w:sz w:val="32"/>
+          <w:szCs w:val="32"/>
+          <w:u w:val="single"/>
+          <w:lang w:val="en-US"/>
+        </w:rPr>
+        <w:t>Create repo in github and then proceed:</w:t>
+      </w:r>
+    </w:p>
+    <w:p>
+      <w:pPr>
+        <w:pStyle w:val="ListParagraph"/>
+        <w:numPr>
+          <w:ilvl w:val="0"/>
+          <w:numId w:val="7"/>
+        </w:numPr>
+        <w:rPr>
+          <w:rFonts w:cstheme="minorHAnsi"/>
+          <w:sz w:val="28"/>
+          <w:szCs w:val="28"/>
+          <w:lang w:val="en-US"/>
+        </w:rPr>
+      </w:pPr>
+      <w:r>
+        <w:rPr>
+          <w:rFonts w:cstheme="minorHAnsi"/>
+          <w:sz w:val="28"/>
+          <w:szCs w:val="28"/>
+          <w:lang w:val="en-US"/>
+        </w:rPr>
+        <w:t>Create a new repository in github by clicking new repository and set to public.</w:t>
+      </w:r>
+    </w:p>
+    <w:p>
+      <w:pPr>
+        <w:pStyle w:val="ListParagraph"/>
+        <w:numPr>
+          <w:ilvl w:val="0"/>
+          <w:numId w:val="7"/>
+        </w:numPr>
+        <w:rPr>
+          <w:rFonts w:cstheme="minorHAnsi"/>
+          <w:sz w:val="28"/>
+          <w:szCs w:val="28"/>
+          <w:lang w:val="en-US"/>
+        </w:rPr>
+      </w:pPr>
+      <w:r>
+        <w:rPr>
+          <w:rFonts w:cstheme="minorHAnsi"/>
+          <w:sz w:val="28"/>
+          <w:szCs w:val="28"/>
+          <w:lang w:val="en-US"/>
+        </w:rPr>
+        <w:t>To initialize git – git init</w:t>
+      </w:r>
+    </w:p>
+    <w:p>
+      <w:pPr>
+        <w:pStyle w:val="ListParagraph"/>
+        <w:numPr>
+          <w:ilvl w:val="0"/>
+          <w:numId w:val="7"/>
+        </w:numPr>
+        <w:rPr>
+          <w:rFonts w:cstheme="minorHAnsi"/>
+          <w:sz w:val="28"/>
+          <w:szCs w:val="28"/>
+          <w:lang w:val="en-US"/>
+        </w:rPr>
+      </w:pPr>
+      <w:r>
+        <w:rPr>
+          <w:rFonts w:cstheme="minorHAnsi"/>
+          <w:sz w:val="28"/>
+          <w:szCs w:val="28"/>
+          <w:lang w:val="en-US"/>
+        </w:rPr>
+        <w:t xml:space="preserve">We don’t need node modules so add node modules to .gitignore using </w:t>
+      </w:r>
+    </w:p>
+    <w:p>
+      <w:pPr>
+        <w:pStyle w:val="ListParagraph"/>
+        <w:numPr>
+          <w:ilvl w:val="0"/>
+          <w:numId w:val="7"/>
+        </w:numPr>
+        <w:rPr>
+          <w:rFonts w:cstheme="minorHAnsi"/>
+          <w:sz w:val="28"/>
+          <w:szCs w:val="28"/>
+          <w:lang w:val="en-US"/>
+        </w:rPr>
+      </w:pPr>
+      <w:r>
+        <w:rPr>
+          <w:rFonts w:cstheme="minorHAnsi"/>
+          <w:sz w:val="28"/>
+          <w:szCs w:val="28"/>
+          <w:lang w:val="en-US"/>
+        </w:rPr>
+        <w:t>Then add files to commit the files– git add .</w:t>
+      </w:r>
+    </w:p>
+    <w:p>
+      <w:pPr>
+        <w:pStyle w:val="ListParagraph"/>
+        <w:numPr>
+          <w:ilvl w:val="0"/>
+          <w:numId w:val="7"/>
+        </w:numPr>
+        <w:rPr>
+          <w:rFonts w:cstheme="minorHAnsi"/>
+          <w:sz w:val="28"/>
+          <w:szCs w:val="28"/>
+          <w:lang w:val="en-US"/>
+        </w:rPr>
+      </w:pPr>
+      <w:r>
+        <w:rPr>
+          <w:rFonts w:cstheme="minorHAnsi"/>
+          <w:sz w:val="28"/>
+          <w:szCs w:val="28"/>
+          <w:lang w:val="en-US"/>
+        </w:rPr>
+        <w:t>To check the status – git status.</w:t>
+      </w:r>
+    </w:p>
+    <w:p>
+      <w:pPr>
+        <w:pStyle w:val="ListParagraph"/>
+        <w:numPr>
+          <w:ilvl w:val="0"/>
+          <w:numId w:val="7"/>
+        </w:numPr>
+        <w:rPr>
+          <w:rFonts w:cstheme="minorHAnsi"/>
+          <w:sz w:val="28"/>
+          <w:szCs w:val="28"/>
+          <w:lang w:val="en-US"/>
+        </w:rPr>
+      </w:pPr>
+      <w:r>
+        <w:rPr>
+          <w:rFonts w:cstheme="minorHAnsi"/>
+          <w:sz w:val="28"/>
+          <w:szCs w:val="28"/>
+          <w:lang w:val="en-US"/>
+        </w:rPr>
+        <w:t>To commit the files – git commit -m “message”.</w:t>
+      </w:r>
+    </w:p>
+    <w:p>
+      <w:pPr>
+        <w:pStyle w:val="ListParagraph"/>
+        <w:numPr>
+          <w:ilvl w:val="0"/>
+          <w:numId w:val="7"/>
+        </w:numPr>
+        <w:rPr>
+          <w:rFonts w:cstheme="minorHAnsi"/>
+          <w:sz w:val="28"/>
+          <w:szCs w:val="28"/>
+        </w:rPr>
+      </w:pPr>
+      <w:r>
+        <w:rPr>
+          <w:rFonts w:cstheme="minorHAnsi"/>
+          <w:sz w:val="28"/>
+          <w:szCs w:val="28"/>
+        </w:rPr>
+        <w:t>git remote add origin https://github.com/surendar-27/</w:t>
+      </w:r>
+      <w:r>
+        <w:rPr>
+          <w:rFonts w:cstheme="minorHAnsi"/>
+          <w:sz w:val="28"/>
+          <w:szCs w:val="28"/>
+        </w:rPr>
+        <w:t>reponame</w:t>
+      </w:r>
+      <w:r>
+        <w:rPr>
+          <w:rFonts w:cstheme="minorHAnsi"/>
+          <w:sz w:val="28"/>
+          <w:szCs w:val="28"/>
+        </w:rPr>
+        <w:t>.git</w:t>
+      </w:r>
+    </w:p>
+    <w:p>
+      <w:pPr>
+        <w:pStyle w:val="ListParagraph"/>
+        <w:numPr>
+          <w:ilvl w:val="0"/>
+          <w:numId w:val="7"/>
+        </w:numPr>
+        <w:rPr>
+          <w:rFonts w:cstheme="minorHAnsi"/>
+          <w:sz w:val="28"/>
+          <w:szCs w:val="28"/>
+          <w:lang w:val="en-US"/>
+        </w:rPr>
+      </w:pPr>
+      <w:r>
+        <w:rPr>
+          <w:rFonts w:cstheme="minorHAnsi"/>
+          <w:sz w:val="28"/>
+          <w:szCs w:val="28"/>
+          <w:lang w:val="en-US"/>
+        </w:rPr>
+        <w:t xml:space="preserve">git branch -M </w:t>
+      </w:r>
+      <w:r>
+        <w:rPr>
+          <w:rFonts w:cstheme="minorHAnsi"/>
+          <w:sz w:val="28"/>
+          <w:szCs w:val="28"/>
+          <w:lang w:val="en-US"/>
+        </w:rPr>
+        <w:t>main</w:t>
+      </w:r>
+    </w:p>
+    <w:p>
+      <w:pPr>
+        <w:pStyle w:val="ListParagraph"/>
+        <w:numPr>
+          <w:ilvl w:val="0"/>
+          <w:numId w:val="7"/>
+        </w:numPr>
+        <w:rPr>
+          <w:rFonts w:cstheme="minorHAnsi"/>
+          <w:sz w:val="28"/>
+          <w:szCs w:val="28"/>
+          <w:lang w:val="en-US"/>
+        </w:rPr>
+      </w:pPr>
+      <w:r>
+        <w:rPr>
+          <w:rFonts w:cstheme="minorHAnsi"/>
+          <w:sz w:val="28"/>
+          <w:szCs w:val="28"/>
+          <w:lang w:val="en-US"/>
+        </w:rPr>
+        <w:t>git push -u origin main</w:t>
+      </w:r>
+    </w:p>
+    <w:p>
+      <w:pPr>
+        <w:pStyle w:val="ListParagraph"/>
+        <w:numPr>
+          <w:ilvl w:val="0"/>
+          <w:numId w:val="7"/>
+        </w:numPr>
+        <w:rPr>
+          <w:rFonts w:cstheme="minorHAnsi"/>
+          <w:sz w:val="28"/>
+          <w:szCs w:val="28"/>
+          <w:lang w:val="en-US"/>
+        </w:rPr>
+      </w:pPr>
+      <w:r>
+        <w:rPr>
+          <w:rFonts w:cstheme="minorHAnsi"/>
+          <w:sz w:val="28"/>
+          <w:szCs w:val="28"/>
+          <w:lang w:val="en-US"/>
+        </w:rPr>
+        <w:t>To create branch in repo goto branches inside that new branch button available then give name and select source.</w:t>
+      </w:r>
+    </w:p>
+    <w:p>
+      <w:pPr>
+        <w:pStyle w:val="ListParagraph"/>
+        <w:numPr>
+          <w:ilvl w:val="0"/>
+          <w:numId w:val="4"/>
+        </w:numPr>
+        <w:rPr>
+          <w:rFonts w:cstheme="minorHAnsi"/>
+          <w:sz w:val="28"/>
+          <w:szCs w:val="28"/>
+          <w:lang w:val="en-US"/>
+        </w:rPr>
+      </w:pPr>
+      <w:r>
+        <w:rPr>
+          <w:rFonts w:cstheme="minorHAnsi"/>
+          <w:sz w:val="28"/>
+          <w:szCs w:val="28"/>
+          <w:lang w:val="en-US"/>
+        </w:rPr>
+        <w:t>To checkout to the branch created</w:t>
+      </w:r>
+    </w:p>
+    <w:p>
+      <w:pPr>
+        <w:rPr>
+          <w:rFonts w:ascii="Algerian" w:hAnsi="Algerian" w:cstheme="minorHAnsi"/>
+          <w:b/>
+          <w:bCs/>
+          <w:sz w:val="36"/>
+          <w:szCs w:val="36"/>
+          <w:u w:val="single"/>
+          <w:lang w:val="en-US"/>
+        </w:rPr>
+      </w:pPr>
+      <w:r>
+        <w:rPr>
+          <w:rFonts w:ascii="Algerian" w:hAnsi="Algerian" w:cstheme="minorHAnsi"/>
+          <w:b/>
+          <w:bCs/>
+          <w:sz w:val="36"/>
+          <w:szCs w:val="36"/>
           <w:u w:val="single"/>
           <w:lang w:val="en-US"/>
         </w:rPr>
@@ -242,16 +632,16 @@
           <w:rFonts w:cstheme="minorHAnsi"/>
           <w:b/>
           <w:bCs/>
-          <w:sz w:val="40"/>
-          <w:szCs w:val="40"/>
-          <w:lang w:val="en-US"/>
-        </w:rPr>
-      </w:pPr>
-      <w:r>
-        <w:rPr>
-          <w:rFonts w:cstheme="minorHAnsi"/>
-          <w:sz w:val="40"/>
-          <w:szCs w:val="40"/>
+          <w:sz w:val="28"/>
+          <w:szCs w:val="28"/>
+          <w:lang w:val="en-US"/>
+        </w:rPr>
+      </w:pPr>
+      <w:r>
+        <w:rPr>
+          <w:rFonts w:cstheme="minorHAnsi"/>
+          <w:sz w:val="28"/>
+          <w:szCs w:val="28"/>
           <w:lang w:val="en-US"/>
         </w:rPr>
         <w:t>Inside create Backend folder for backend stuffs.</w:t>
@@ -268,59 +658,19 @@
           <w:rFonts w:cstheme="minorHAnsi"/>
           <w:b/>
           <w:bCs/>
-          <w:sz w:val="40"/>
-          <w:szCs w:val="40"/>
-          <w:lang w:val="en-US"/>
-        </w:rPr>
-      </w:pPr>
-      <w:r>
-        <w:rPr>
-          <w:rFonts w:cstheme="minorHAnsi"/>
-          <w:sz w:val="40"/>
-          <w:szCs w:val="40"/>
-          <w:lang w:val="en-US"/>
-        </w:rPr>
-        <w:t xml:space="preserve">Run </w:t>
-      </w:r>
-      <w:proofErr w:type="spellStart"/>
-      <w:r>
-        <w:rPr>
-          <w:rFonts w:cstheme="minorHAnsi"/>
-          <w:sz w:val="40"/>
-          <w:szCs w:val="40"/>
-          <w:lang w:val="en-US"/>
-        </w:rPr>
-        <w:t>npm</w:t>
-      </w:r>
-      <w:proofErr w:type="spellEnd"/>
-      <w:r>
-        <w:rPr>
-          <w:rFonts w:cstheme="minorHAnsi"/>
-          <w:sz w:val="40"/>
-          <w:szCs w:val="40"/>
-          <w:lang w:val="en-US"/>
-        </w:rPr>
-        <w:t xml:space="preserve"> </w:t>
-      </w:r>
-      <w:proofErr w:type="spellStart"/>
-      <w:r>
-        <w:rPr>
-          <w:rFonts w:cstheme="minorHAnsi"/>
-          <w:sz w:val="40"/>
-          <w:szCs w:val="40"/>
-          <w:lang w:val="en-US"/>
-        </w:rPr>
-        <w:t>init</w:t>
-      </w:r>
-      <w:proofErr w:type="spellEnd"/>
-      <w:r>
-        <w:rPr>
-          <w:rFonts w:cstheme="minorHAnsi"/>
-          <w:sz w:val="40"/>
-          <w:szCs w:val="40"/>
-          <w:lang w:val="en-US"/>
-        </w:rPr>
-        <w:t xml:space="preserve"> command inside backend folder.</w:t>
+          <w:sz w:val="28"/>
+          <w:szCs w:val="28"/>
+          <w:lang w:val="en-US"/>
+        </w:rPr>
+      </w:pPr>
+      <w:r>
+        <w:rPr>
+          <w:rFonts w:cstheme="minorHAnsi"/>
+          <w:sz w:val="28"/>
+          <w:szCs w:val="28"/>
+          <w:lang w:val="en-US"/>
+        </w:rPr>
+        <w:t>Run npm init command inside backend folder.</w:t>
       </w:r>
     </w:p>
     <w:p>
@@ -334,16 +684,16 @@
           <w:rFonts w:cstheme="minorHAnsi"/>
           <w:b/>
           <w:bCs/>
-          <w:sz w:val="40"/>
-          <w:szCs w:val="40"/>
-          <w:lang w:val="en-US"/>
-        </w:rPr>
-      </w:pPr>
-      <w:r>
-        <w:rPr>
-          <w:rFonts w:cstheme="minorHAnsi"/>
-          <w:sz w:val="40"/>
-          <w:szCs w:val="40"/>
+          <w:sz w:val="28"/>
+          <w:szCs w:val="28"/>
+          <w:lang w:val="en-US"/>
+        </w:rPr>
+      </w:pPr>
+      <w:r>
+        <w:rPr>
+          <w:rFonts w:cstheme="minorHAnsi"/>
+          <w:sz w:val="28"/>
+          <w:szCs w:val="28"/>
           <w:lang w:val="en-US"/>
         </w:rPr>
         <w:t xml:space="preserve">Then enter to complete </w:t>
@@ -351,31 +701,11 @@
       <w:r>
         <w:rPr>
           <w:rFonts w:cstheme="minorHAnsi"/>
-          <w:sz w:val="40"/>
-          <w:szCs w:val="40"/>
-          <w:lang w:val="en-US"/>
-        </w:rPr>
-        <w:t xml:space="preserve">and then create app.js file for </w:t>
-      </w:r>
-      <w:proofErr w:type="spellStart"/>
-      <w:r>
-        <w:rPr>
-          <w:rFonts w:cstheme="minorHAnsi"/>
-          <w:sz w:val="40"/>
-          <w:szCs w:val="40"/>
-          <w:lang w:val="en-US"/>
-        </w:rPr>
-        <w:t>api</w:t>
-      </w:r>
-      <w:proofErr w:type="spellEnd"/>
-      <w:r>
-        <w:rPr>
-          <w:rFonts w:cstheme="minorHAnsi"/>
-          <w:sz w:val="40"/>
-          <w:szCs w:val="40"/>
-          <w:lang w:val="en-US"/>
-        </w:rPr>
-        <w:t xml:space="preserve"> calls.</w:t>
+          <w:sz w:val="28"/>
+          <w:szCs w:val="28"/>
+          <w:lang w:val="en-US"/>
+        </w:rPr>
+        <w:t>and then create app.js file for api calls.</w:t>
       </w:r>
     </w:p>
     <w:p>
@@ -389,39 +719,19 @@
           <w:rFonts w:cstheme="minorHAnsi"/>
           <w:b/>
           <w:bCs/>
-          <w:sz w:val="40"/>
-          <w:szCs w:val="40"/>
-          <w:lang w:val="en-US"/>
-        </w:rPr>
-      </w:pPr>
-      <w:r>
-        <w:rPr>
-          <w:rFonts w:cstheme="minorHAnsi"/>
-          <w:sz w:val="40"/>
-          <w:szCs w:val="40"/>
-          <w:lang w:val="en-US"/>
-        </w:rPr>
-        <w:t xml:space="preserve">Instead save and run again and again after changes we install </w:t>
-      </w:r>
-      <w:proofErr w:type="spellStart"/>
-      <w:r>
-        <w:rPr>
-          <w:rFonts w:cstheme="minorHAnsi"/>
-          <w:sz w:val="40"/>
-          <w:szCs w:val="40"/>
-          <w:lang w:val="en-US"/>
-        </w:rPr>
-        <w:t>nodemon</w:t>
-      </w:r>
-      <w:proofErr w:type="spellEnd"/>
-      <w:r>
-        <w:rPr>
-          <w:rFonts w:cstheme="minorHAnsi"/>
-          <w:sz w:val="40"/>
-          <w:szCs w:val="40"/>
-          <w:lang w:val="en-US"/>
-        </w:rPr>
-        <w:t xml:space="preserve"> to autodetect and run.</w:t>
+          <w:sz w:val="28"/>
+          <w:szCs w:val="28"/>
+          <w:lang w:val="en-US"/>
+        </w:rPr>
+      </w:pPr>
+      <w:r>
+        <w:rPr>
+          <w:rFonts w:cstheme="minorHAnsi"/>
+          <w:sz w:val="28"/>
+          <w:szCs w:val="28"/>
+          <w:lang w:val="en-US"/>
+        </w:rPr>
+        <w:t>Instead save and run again and again after changes we install nodemon to autodetect and run.</w:t>
       </w:r>
     </w:p>
     <w:p>
@@ -435,90 +745,20 @@
           <w:rFonts w:cstheme="minorHAnsi"/>
           <w:b/>
           <w:bCs/>
-          <w:sz w:val="40"/>
-          <w:szCs w:val="40"/>
-          <w:lang w:val="en-US"/>
-        </w:rPr>
-      </w:pPr>
-      <w:proofErr w:type="gramStart"/>
-      <w:r>
-        <w:rPr>
-          <w:rFonts w:cstheme="minorHAnsi"/>
-          <w:sz w:val="40"/>
-          <w:szCs w:val="40"/>
-          <w:lang w:val="en-US"/>
-        </w:rPr>
-        <w:t>So</w:t>
-      </w:r>
-      <w:proofErr w:type="gramEnd"/>
-      <w:r>
-        <w:rPr>
-          <w:rFonts w:cstheme="minorHAnsi"/>
-          <w:sz w:val="40"/>
-          <w:szCs w:val="40"/>
-          <w:lang w:val="en-US"/>
-        </w:rPr>
-        <w:t xml:space="preserve"> install </w:t>
-      </w:r>
-      <w:proofErr w:type="spellStart"/>
-      <w:r>
-        <w:rPr>
-          <w:rFonts w:cstheme="minorHAnsi"/>
-          <w:sz w:val="40"/>
-          <w:szCs w:val="40"/>
-          <w:lang w:val="en-US"/>
-        </w:rPr>
-        <w:t>nodemon</w:t>
-      </w:r>
-      <w:proofErr w:type="spellEnd"/>
-      <w:r>
-        <w:rPr>
-          <w:rFonts w:cstheme="minorHAnsi"/>
-          <w:sz w:val="40"/>
-          <w:szCs w:val="40"/>
-          <w:lang w:val="en-US"/>
-        </w:rPr>
-        <w:t xml:space="preserve"> using </w:t>
-      </w:r>
-      <w:proofErr w:type="spellStart"/>
-      <w:r>
-        <w:rPr>
-          <w:rFonts w:cstheme="minorHAnsi"/>
-          <w:sz w:val="40"/>
-          <w:szCs w:val="40"/>
-          <w:lang w:val="en-US"/>
-        </w:rPr>
-        <w:t>npm</w:t>
-      </w:r>
-      <w:proofErr w:type="spellEnd"/>
-      <w:r>
-        <w:rPr>
-          <w:rFonts w:cstheme="minorHAnsi"/>
-          <w:sz w:val="40"/>
-          <w:szCs w:val="40"/>
-          <w:lang w:val="en-US"/>
-        </w:rPr>
-        <w:t xml:space="preserve"> I </w:t>
-      </w:r>
-      <w:proofErr w:type="spellStart"/>
-      <w:r>
-        <w:rPr>
-          <w:rFonts w:cstheme="minorHAnsi"/>
-          <w:sz w:val="40"/>
-          <w:szCs w:val="40"/>
-          <w:lang w:val="en-US"/>
-        </w:rPr>
-        <w:t>nodemon</w:t>
-      </w:r>
-      <w:proofErr w:type="spellEnd"/>
-      <w:r>
-        <w:rPr>
-          <w:rFonts w:cstheme="minorHAnsi"/>
-          <w:sz w:val="40"/>
-          <w:szCs w:val="40"/>
-          <w:lang w:val="en-US"/>
-        </w:rPr>
-        <w:t>.</w:t>
+          <w:sz w:val="28"/>
+          <w:szCs w:val="28"/>
+          <w:lang w:val="en-US"/>
+        </w:rPr>
+      </w:pPr>
+      <w:r>
+        <w:rPr>
+          <w:rFonts w:cstheme="minorHAnsi"/>
+          <w:sz w:val="28"/>
+          <w:szCs w:val="28"/>
+          <w:lang w:val="en-US"/>
+        </w:rPr>
+        <w:lastRenderedPageBreak/>
+        <w:t>So install nodemon using npm I nodemon.</w:t>
       </w:r>
     </w:p>
     <w:p>
@@ -532,59 +772,19 @@
           <w:rFonts w:cstheme="minorHAnsi"/>
           <w:b/>
           <w:bCs/>
-          <w:sz w:val="40"/>
-          <w:szCs w:val="40"/>
-          <w:lang w:val="en-US"/>
-        </w:rPr>
-      </w:pPr>
-      <w:r>
-        <w:rPr>
-          <w:rFonts w:cstheme="minorHAnsi"/>
-          <w:sz w:val="40"/>
-          <w:szCs w:val="40"/>
-          <w:lang w:val="en-US"/>
-        </w:rPr>
-        <w:t xml:space="preserve">To run </w:t>
-      </w:r>
-      <w:proofErr w:type="spellStart"/>
-      <w:r>
-        <w:rPr>
-          <w:rFonts w:cstheme="minorHAnsi"/>
-          <w:sz w:val="40"/>
-          <w:szCs w:val="40"/>
-          <w:lang w:val="en-US"/>
-        </w:rPr>
-        <w:t>nodemon</w:t>
-      </w:r>
-      <w:proofErr w:type="spellEnd"/>
-      <w:r>
-        <w:rPr>
-          <w:rFonts w:cstheme="minorHAnsi"/>
-          <w:sz w:val="40"/>
-          <w:szCs w:val="40"/>
-          <w:lang w:val="en-US"/>
-        </w:rPr>
-        <w:t xml:space="preserve"> file name i.e., </w:t>
-      </w:r>
-      <w:proofErr w:type="spellStart"/>
-      <w:r>
-        <w:rPr>
-          <w:rFonts w:cstheme="minorHAnsi"/>
-          <w:sz w:val="40"/>
-          <w:szCs w:val="40"/>
-          <w:lang w:val="en-US"/>
-        </w:rPr>
-        <w:t>nodemon</w:t>
-      </w:r>
-      <w:proofErr w:type="spellEnd"/>
-      <w:r>
-        <w:rPr>
-          <w:rFonts w:cstheme="minorHAnsi"/>
-          <w:sz w:val="40"/>
-          <w:szCs w:val="40"/>
-          <w:lang w:val="en-US"/>
-        </w:rPr>
-        <w:t xml:space="preserve"> .\app.js.</w:t>
+          <w:sz w:val="28"/>
+          <w:szCs w:val="28"/>
+          <w:lang w:val="en-US"/>
+        </w:rPr>
+      </w:pPr>
+      <w:r>
+        <w:rPr>
+          <w:rFonts w:cstheme="minorHAnsi"/>
+          <w:sz w:val="28"/>
+          <w:szCs w:val="28"/>
+          <w:lang w:val="en-US"/>
+        </w:rPr>
+        <w:t>To run nodemon file name i.e., nodemon .\app.js.</w:t>
       </w:r>
     </w:p>
     <w:p>
@@ -598,34 +798,20 @@
           <w:rFonts w:cstheme="minorHAnsi"/>
           <w:b/>
           <w:bCs/>
-          <w:sz w:val="40"/>
-          <w:szCs w:val="40"/>
-          <w:lang w:val="en-US"/>
-        </w:rPr>
-      </w:pPr>
-      <w:r>
-        <w:rPr>
-          <w:rFonts w:cstheme="minorHAnsi"/>
-          <w:sz w:val="40"/>
-          <w:szCs w:val="40"/>
-          <w:lang w:val="en-US"/>
-        </w:rPr>
-        <w:lastRenderedPageBreak/>
-        <w:t xml:space="preserve">To make backend run simpler add this in scripts under </w:t>
-      </w:r>
-      <w:proofErr w:type="spellStart"/>
-      <w:proofErr w:type="gramStart"/>
-      <w:r>
-        <w:rPr>
-          <w:rFonts w:cstheme="minorHAnsi"/>
-          <w:sz w:val="40"/>
-          <w:szCs w:val="40"/>
-          <w:lang w:val="en-US"/>
-        </w:rPr>
-        <w:t>package.json</w:t>
-      </w:r>
-      <w:proofErr w:type="spellEnd"/>
-      <w:proofErr w:type="gramEnd"/>
+          <w:sz w:val="28"/>
+          <w:szCs w:val="28"/>
+          <w:lang w:val="en-US"/>
+        </w:rPr>
+      </w:pPr>
+      <w:r>
+        <w:rPr>
+          <w:rFonts w:cstheme="minorHAnsi"/>
+          <w:sz w:val="28"/>
+          <w:szCs w:val="28"/>
+          <w:lang w:val="en-US"/>
+        </w:rPr>
+        <w:t>To make backend run simpler add this in scripts under package.json</w:t>
+      </w:r>
     </w:p>
     <w:p>
       <w:pPr>
@@ -638,30 +824,19 @@
           <w:rFonts w:cstheme="minorHAnsi"/>
           <w:b/>
           <w:bCs/>
-          <w:sz w:val="40"/>
-          <w:szCs w:val="40"/>
-          <w:lang w:val="en-US"/>
-        </w:rPr>
-      </w:pPr>
-      <w:proofErr w:type="spellStart"/>
-      <w:r>
-        <w:rPr>
-          <w:rFonts w:cstheme="minorHAnsi"/>
-          <w:sz w:val="40"/>
-          <w:szCs w:val="40"/>
-          <w:lang w:val="en-US"/>
-        </w:rPr>
-        <w:t>Package.json</w:t>
-      </w:r>
-      <w:proofErr w:type="spellEnd"/>
-      <w:r>
-        <w:rPr>
-          <w:rFonts w:cstheme="minorHAnsi"/>
-          <w:sz w:val="40"/>
-          <w:szCs w:val="40"/>
-          <w:lang w:val="en-US"/>
-        </w:rPr>
-        <w:t>-&gt;Main Scripts-&gt; add:</w:t>
+          <w:sz w:val="28"/>
+          <w:szCs w:val="28"/>
+          <w:lang w:val="en-US"/>
+        </w:rPr>
+      </w:pPr>
+      <w:r>
+        <w:rPr>
+          <w:rFonts w:cstheme="minorHAnsi"/>
+          <w:sz w:val="28"/>
+          <w:szCs w:val="28"/>
+          <w:lang w:val="en-US"/>
+        </w:rPr>
+        <w:t>Package.json-&gt;Main Scripts-&gt; add:</w:t>
       </w:r>
     </w:p>
     <w:p>
@@ -673,50 +848,19 @@
         </w:numPr>
         <w:rPr>
           <w:rFonts w:cstheme="minorHAnsi"/>
-          <w:sz w:val="40"/>
-          <w:szCs w:val="40"/>
-          <w:lang w:val="en-US"/>
-        </w:rPr>
-      </w:pPr>
-      <w:r>
-        <w:rPr>
-          <w:rFonts w:cstheme="minorHAnsi"/>
-          <w:sz w:val="40"/>
-          <w:szCs w:val="40"/>
-          <w:lang w:val="en-US"/>
-        </w:rPr>
-        <w:t>“start”</w:t>
-      </w:r>
-      <w:proofErr w:type="gramStart"/>
-      <w:r>
-        <w:rPr>
-          <w:rFonts w:cstheme="minorHAnsi"/>
-          <w:sz w:val="40"/>
-          <w:szCs w:val="40"/>
-          <w:lang w:val="en-US"/>
-        </w:rPr>
-        <w:t>:”</w:t>
-      </w:r>
-      <w:proofErr w:type="spellStart"/>
-      <w:r>
-        <w:rPr>
-          <w:rFonts w:cstheme="minorHAnsi"/>
-          <w:sz w:val="40"/>
-          <w:szCs w:val="40"/>
-          <w:lang w:val="en-US"/>
-        </w:rPr>
-        <w:t>nodemon</w:t>
-      </w:r>
-      <w:proofErr w:type="spellEnd"/>
-      <w:proofErr w:type="gramEnd"/>
-      <w:r>
-        <w:rPr>
-          <w:rFonts w:cstheme="minorHAnsi"/>
-          <w:sz w:val="40"/>
-          <w:szCs w:val="40"/>
-          <w:lang w:val="en-US"/>
-        </w:rPr>
-        <w:t xml:space="preserve"> app.js”</w:t>
+          <w:sz w:val="28"/>
+          <w:szCs w:val="28"/>
+          <w:lang w:val="en-US"/>
+        </w:rPr>
+      </w:pPr>
+      <w:r>
+        <w:rPr>
+          <w:rFonts w:cstheme="minorHAnsi"/>
+          <w:sz w:val="28"/>
+          <w:szCs w:val="28"/>
+          <w:lang w:val="en-US"/>
+        </w:rPr>
+        <w:t>“start”:”nodemon app.js”</w:t>
       </w:r>
     </w:p>
     <w:p>
@@ -730,59 +874,19 @@
           <w:rFonts w:cstheme="minorHAnsi"/>
           <w:b/>
           <w:bCs/>
-          <w:sz w:val="40"/>
-          <w:szCs w:val="40"/>
-          <w:lang w:val="en-US"/>
-        </w:rPr>
-      </w:pPr>
-      <w:r>
-        <w:rPr>
-          <w:rFonts w:cstheme="minorHAnsi"/>
-          <w:sz w:val="40"/>
-          <w:szCs w:val="40"/>
-          <w:lang w:val="en-US"/>
-        </w:rPr>
-        <w:t xml:space="preserve">now use </w:t>
-      </w:r>
-      <w:proofErr w:type="spellStart"/>
-      <w:r>
-        <w:rPr>
-          <w:rFonts w:cstheme="minorHAnsi"/>
-          <w:sz w:val="40"/>
-          <w:szCs w:val="40"/>
-          <w:lang w:val="en-US"/>
-        </w:rPr>
-        <w:t>npm</w:t>
-      </w:r>
-      <w:proofErr w:type="spellEnd"/>
-      <w:r>
-        <w:rPr>
-          <w:rFonts w:cstheme="minorHAnsi"/>
-          <w:sz w:val="40"/>
-          <w:szCs w:val="40"/>
-          <w:lang w:val="en-US"/>
-        </w:rPr>
-        <w:t xml:space="preserve"> start instead of </w:t>
-      </w:r>
-      <w:proofErr w:type="spellStart"/>
-      <w:r>
-        <w:rPr>
-          <w:rFonts w:cstheme="minorHAnsi"/>
-          <w:sz w:val="40"/>
-          <w:szCs w:val="40"/>
-          <w:lang w:val="en-US"/>
-        </w:rPr>
-        <w:t>nodemon</w:t>
-      </w:r>
-      <w:proofErr w:type="spellEnd"/>
-      <w:r>
-        <w:rPr>
-          <w:rFonts w:cstheme="minorHAnsi"/>
-          <w:sz w:val="40"/>
-          <w:szCs w:val="40"/>
-          <w:lang w:val="en-US"/>
-        </w:rPr>
-        <w:t xml:space="preserve"> app.js.</w:t>
+          <w:sz w:val="28"/>
+          <w:szCs w:val="28"/>
+          <w:lang w:val="en-US"/>
+        </w:rPr>
+      </w:pPr>
+      <w:r>
+        <w:rPr>
+          <w:rFonts w:cstheme="minorHAnsi"/>
+          <w:sz w:val="28"/>
+          <w:szCs w:val="28"/>
+          <w:lang w:val="en-US"/>
+        </w:rPr>
+        <w:t>now use npm start instead of nodemon app.js.</w:t>
       </w:r>
     </w:p>
     <w:p>
@@ -796,26 +900,1020 @@
           <w:rFonts w:cstheme="minorHAnsi"/>
           <w:b/>
           <w:bCs/>
-          <w:sz w:val="40"/>
-          <w:szCs w:val="40"/>
-          <w:lang w:val="en-US"/>
-        </w:rPr>
-      </w:pPr>
-    </w:p>
-    <w:p>
-      <w:pPr>
+          <w:sz w:val="28"/>
+          <w:szCs w:val="28"/>
+          <w:lang w:val="en-US"/>
+        </w:rPr>
+      </w:pPr>
+      <w:r>
+        <w:rPr>
+          <w:rFonts w:cstheme="minorHAnsi"/>
+          <w:sz w:val="28"/>
+          <w:szCs w:val="28"/>
+          <w:lang w:val="en-US"/>
+        </w:rPr>
+        <w:t>Install express to connect with api’s – npm install express.</w:t>
+      </w:r>
+    </w:p>
+    <w:p>
+      <w:pPr>
+        <w:pStyle w:val="ListParagraph"/>
+        <w:rPr>
+          <w:rFonts w:cstheme="minorHAnsi"/>
+          <w:sz w:val="28"/>
+          <w:szCs w:val="28"/>
+          <w:lang w:val="en-US"/>
+        </w:rPr>
+      </w:pPr>
+      <w:r>
+        <w:rPr>
+          <w:rFonts w:cstheme="minorHAnsi"/>
+          <w:sz w:val="28"/>
+          <w:szCs w:val="28"/>
+          <w:lang w:val="en-US"/>
+        </w:rPr>
+        <w:t>App.js:</w:t>
+      </w:r>
+    </w:p>
+    <w:p>
+      <w:pPr>
+        <w:pStyle w:val="ListParagraph"/>
+        <w:ind w:firstLine="720"/>
+        <w:rPr>
+          <w:rFonts w:cstheme="minorHAnsi"/>
+          <w:sz w:val="28"/>
+          <w:szCs w:val="28"/>
+          <w:lang w:val="en-US"/>
+        </w:rPr>
+      </w:pPr>
+      <w:r>
+        <w:rPr>
+          <w:rFonts w:cstheme="minorHAnsi"/>
+          <w:sz w:val="28"/>
+          <w:szCs w:val="28"/>
+          <w:lang w:val="en-US"/>
+        </w:rPr>
+        <w:t>Basic express imported using require. Created a app and made it to listen to port no 3000 followed by callback function and consoled to know whether</w:t>
+      </w:r>
+      <w:r>
+        <w:rPr>
+          <w:rFonts w:cstheme="minorHAnsi"/>
+          <w:sz w:val="28"/>
+          <w:szCs w:val="28"/>
+          <w:lang w:val="en-US"/>
+        </w:rPr>
+        <w:t xml:space="preserve"> to find</w:t>
+      </w:r>
+      <w:r>
+        <w:rPr>
+          <w:rFonts w:cstheme="minorHAnsi"/>
+          <w:sz w:val="28"/>
+          <w:szCs w:val="28"/>
+          <w:lang w:val="en-US"/>
+        </w:rPr>
+        <w:t xml:space="preserve"> running or not</w:t>
+      </w:r>
+      <w:r>
+        <w:rPr>
+          <w:rFonts w:cstheme="minorHAnsi"/>
+          <w:sz w:val="28"/>
+          <w:szCs w:val="28"/>
+          <w:lang w:val="en-US"/>
+        </w:rPr>
+        <w:t xml:space="preserve"> and add production to know where it is running</w:t>
+      </w:r>
+    </w:p>
+    <w:p>
+      <w:pPr>
+        <w:pStyle w:val="ListParagraph"/>
+        <w:rPr>
+          <w:rFonts w:cstheme="minorHAnsi"/>
+          <w:sz w:val="28"/>
+          <w:szCs w:val="28"/>
+          <w:lang w:val="en-US"/>
+        </w:rPr>
+      </w:pPr>
+      <w:r>
+        <w:rPr>
+          <w:rFonts w:cstheme="minorHAnsi"/>
+          <w:sz w:val="28"/>
+          <w:szCs w:val="28"/>
+          <w:lang w:val="en-US"/>
+        </w:rPr>
+        <w:tab/>
+      </w:r>
+      <w:r>
+        <w:rPr>
+          <w:noProof/>
+        </w:rPr>
+        <w:drawing>
+          <wp:inline distT="0" distB="0" distL="0" distR="0" wp14:anchorId="67AA354B" wp14:editId="57D141A6">
+            <wp:extent cx="4054081" cy="1686560"/>
+            <wp:effectExtent l="0" t="0" r="3810" b="8890"/>
+            <wp:docPr id="31282714" name="Picture 1"/>
+            <wp:cNvGraphicFramePr>
+              <a:graphicFrameLocks xmlns:a="http://schemas.openxmlformats.org/drawingml/2006/main" noChangeAspect="1"/>
+            </wp:cNvGraphicFramePr>
+            <a:graphic xmlns:a="http://schemas.openxmlformats.org/drawingml/2006/main">
+              <a:graphicData uri="http://schemas.openxmlformats.org/drawingml/2006/picture">
+                <pic:pic xmlns:pic="http://schemas.openxmlformats.org/drawingml/2006/picture">
+                  <pic:nvPicPr>
+                    <pic:cNvPr id="31282714" name=""/>
+                    <pic:cNvPicPr/>
+                  </pic:nvPicPr>
+                  <pic:blipFill rotWithShape="1">
+                    <a:blip r:embed="rId6"/>
+                    <a:srcRect l="21603" r="10162" b="49534"/>
+                    <a:stretch/>
+                  </pic:blipFill>
+                  <pic:spPr bwMode="auto">
+                    <a:xfrm>
+                      <a:off x="0" y="0"/>
+                      <a:ext cx="4061975" cy="1689844"/>
+                    </a:xfrm>
+                    <a:prstGeom prst="rect">
+                      <a:avLst/>
+                    </a:prstGeom>
+                    <a:ln>
+                      <a:noFill/>
+                    </a:ln>
+                    <a:extLst>
+                      <a:ext uri="{53640926-AAD7-44D8-BBD7-CCE9431645EC}">
+                        <a14:shadowObscured xmlns:a14="http://schemas.microsoft.com/office/drawing/2010/main"/>
+                      </a:ext>
+                    </a:extLst>
+                  </pic:spPr>
+                </pic:pic>
+              </a:graphicData>
+            </a:graphic>
+          </wp:inline>
+        </w:drawing>
+      </w:r>
+    </w:p>
+    <w:p>
+      <w:pPr>
+        <w:pStyle w:val="ListParagraph"/>
+        <w:numPr>
+          <w:ilvl w:val="0"/>
+          <w:numId w:val="1"/>
+        </w:numPr>
         <w:rPr>
           <w:rFonts w:cstheme="minorHAnsi"/>
           <w:b/>
           <w:bCs/>
-          <w:sz w:val="40"/>
-          <w:szCs w:val="40"/>
+          <w:sz w:val="28"/>
+          <w:szCs w:val="28"/>
+          <w:lang w:val="en-US"/>
+        </w:rPr>
+      </w:pPr>
+      <w:r>
+        <w:rPr>
+          <w:rFonts w:cstheme="minorHAnsi"/>
+          <w:sz w:val="28"/>
+          <w:szCs w:val="28"/>
+          <w:lang w:val="en-US"/>
+        </w:rPr>
+        <w:t>Ports maybe variable and production or dev it maybe to avoid changing again and again we setup a environmental variable.</w:t>
+      </w:r>
+    </w:p>
+    <w:p>
+      <w:pPr>
+        <w:pStyle w:val="ListParagraph"/>
+        <w:numPr>
+          <w:ilvl w:val="0"/>
+          <w:numId w:val="8"/>
+        </w:numPr>
+        <w:rPr>
+          <w:rFonts w:cstheme="minorHAnsi"/>
+          <w:b/>
+          <w:bCs/>
+          <w:sz w:val="28"/>
+          <w:szCs w:val="28"/>
+          <w:lang w:val="en-US"/>
+        </w:rPr>
+      </w:pPr>
+      <w:r>
+        <w:rPr>
+          <w:rFonts w:cstheme="minorHAnsi"/>
+          <w:sz w:val="28"/>
+          <w:szCs w:val="28"/>
+          <w:lang w:val="en-US"/>
+        </w:rPr>
+        <w:t>Create a config to contain all configuration variables necessary for application. i.e., config/config.env.</w:t>
+      </w:r>
+      <w:r>
+        <w:rPr>
+          <w:rFonts w:cstheme="minorHAnsi"/>
+          <w:sz w:val="28"/>
+          <w:szCs w:val="28"/>
+          <w:lang w:val="en-US"/>
+        </w:rPr>
+        <w:t xml:space="preserve"> and add the variables like -</w:t>
+      </w:r>
+    </w:p>
+    <w:p>
+      <w:pPr>
+        <w:pStyle w:val="ListParagraph"/>
+        <w:ind w:left="1440"/>
+        <w:rPr>
+          <w:rFonts w:cstheme="minorHAnsi"/>
+          <w:b/>
+          <w:bCs/>
+          <w:sz w:val="28"/>
+          <w:szCs w:val="28"/>
+          <w:lang w:val="en-US"/>
+        </w:rPr>
+      </w:pPr>
+      <w:r>
+        <w:rPr>
+          <w:rFonts w:cstheme="minorHAnsi"/>
+          <w:b/>
+          <w:bCs/>
+          <w:sz w:val="28"/>
+          <w:szCs w:val="28"/>
+          <w:lang w:val="en-US"/>
+        </w:rPr>
+        <w:t xml:space="preserve">=&gt; </w:t>
+      </w:r>
+      <w:r>
+        <w:rPr>
+          <w:rFonts w:cstheme="minorHAnsi"/>
+          <w:b/>
+          <w:bCs/>
+          <w:sz w:val="28"/>
+          <w:szCs w:val="28"/>
+          <w:lang w:val="en-US"/>
+        </w:rPr>
+        <w:t>PORT=8000</w:t>
+      </w:r>
+    </w:p>
+    <w:p>
+      <w:pPr>
+        <w:pStyle w:val="ListParagraph"/>
+        <w:ind w:left="1440"/>
+        <w:rPr>
+          <w:rFonts w:cstheme="minorHAnsi"/>
+          <w:b/>
+          <w:bCs/>
+          <w:sz w:val="28"/>
+          <w:szCs w:val="28"/>
+          <w:lang w:val="en-US"/>
+        </w:rPr>
+      </w:pPr>
+      <w:r>
+        <w:rPr>
+          <w:rFonts w:cstheme="minorHAnsi"/>
+          <w:b/>
+          <w:bCs/>
+          <w:sz w:val="28"/>
+          <w:szCs w:val="28"/>
+          <w:lang w:val="en-US"/>
+        </w:rPr>
+        <w:t xml:space="preserve">=&gt; </w:t>
+      </w:r>
+      <w:r>
+        <w:rPr>
+          <w:rFonts w:cstheme="minorHAnsi"/>
+          <w:b/>
+          <w:bCs/>
+          <w:sz w:val="28"/>
+          <w:szCs w:val="28"/>
+          <w:lang w:val="en-US"/>
+        </w:rPr>
+        <w:t>NODE_ENV=production</w:t>
+      </w:r>
+    </w:p>
+    <w:p>
+      <w:pPr>
+        <w:pStyle w:val="ListParagraph"/>
+        <w:numPr>
+          <w:ilvl w:val="0"/>
+          <w:numId w:val="8"/>
+        </w:numPr>
+        <w:rPr>
+          <w:rFonts w:cstheme="minorHAnsi"/>
+          <w:b/>
+          <w:bCs/>
+          <w:sz w:val="28"/>
+          <w:szCs w:val="28"/>
+          <w:lang w:val="en-US"/>
+        </w:rPr>
+      </w:pPr>
+      <w:r>
+        <w:rPr>
+          <w:rFonts w:cstheme="minorHAnsi"/>
+          <w:sz w:val="28"/>
+          <w:szCs w:val="28"/>
+          <w:lang w:val="en-US"/>
+        </w:rPr>
+        <w:t>To get the variable into application we need a package dotenv.</w:t>
+      </w:r>
+    </w:p>
+    <w:p>
+      <w:pPr>
+        <w:pStyle w:val="ListParagraph"/>
+        <w:numPr>
+          <w:ilvl w:val="0"/>
+          <w:numId w:val="8"/>
+        </w:numPr>
+        <w:rPr>
+          <w:rFonts w:cstheme="minorHAnsi"/>
+          <w:b/>
+          <w:bCs/>
+          <w:sz w:val="28"/>
+          <w:szCs w:val="28"/>
+          <w:lang w:val="en-US"/>
+        </w:rPr>
+      </w:pPr>
+      <w:r>
+        <w:rPr>
+          <w:rFonts w:cstheme="minorHAnsi"/>
+          <w:sz w:val="28"/>
+          <w:szCs w:val="28"/>
+          <w:lang w:val="en-US"/>
+        </w:rPr>
+        <w:t>Npm install dotenv.</w:t>
+      </w:r>
+    </w:p>
+    <w:p>
+      <w:pPr>
+        <w:pStyle w:val="ListParagraph"/>
+        <w:numPr>
+          <w:ilvl w:val="0"/>
+          <w:numId w:val="8"/>
+        </w:numPr>
+        <w:rPr>
+          <w:rFonts w:cstheme="minorHAnsi"/>
+          <w:b/>
+          <w:bCs/>
+          <w:sz w:val="28"/>
+          <w:szCs w:val="28"/>
+          <w:lang w:val="en-US"/>
+        </w:rPr>
+      </w:pPr>
+      <w:r>
+        <w:rPr>
+          <w:rFonts w:cstheme="minorHAnsi"/>
+          <w:sz w:val="28"/>
+          <w:szCs w:val="28"/>
+          <w:lang w:val="en-US"/>
+        </w:rPr>
+        <w:t>Imported dotenv to config variables and path to direct it to the file where the variables are available.</w:t>
+      </w:r>
+    </w:p>
+    <w:p>
+      <w:pPr>
+        <w:pStyle w:val="ListParagraph"/>
+        <w:numPr>
+          <w:ilvl w:val="0"/>
+          <w:numId w:val="8"/>
+        </w:numPr>
+        <w:rPr>
+          <w:rFonts w:cstheme="minorHAnsi"/>
+          <w:sz w:val="28"/>
+          <w:szCs w:val="28"/>
+          <w:lang w:val="en-US"/>
+        </w:rPr>
+      </w:pPr>
+      <w:r>
+        <w:rPr>
+          <w:rFonts w:cstheme="minorHAnsi"/>
+          <w:sz w:val="28"/>
+          <w:szCs w:val="28"/>
+          <w:lang w:val="en-US"/>
+        </w:rPr>
+        <w:t>path.join(__dirname, 'config', 'config.env')</w:t>
+      </w:r>
+      <w:r>
+        <w:rPr>
+          <w:rFonts w:cstheme="minorHAnsi"/>
+          <w:sz w:val="28"/>
+          <w:szCs w:val="28"/>
+          <w:lang w:val="en-US"/>
+        </w:rPr>
+        <w:t xml:space="preserve"> </w:t>
+      </w:r>
+    </w:p>
+    <w:p>
+      <w:pPr>
+        <w:pStyle w:val="ListParagraph"/>
+        <w:numPr>
+          <w:ilvl w:val="0"/>
+          <w:numId w:val="8"/>
+        </w:numPr>
+        <w:rPr>
+          <w:rFonts w:cstheme="minorHAnsi"/>
+          <w:sz w:val="28"/>
+          <w:szCs w:val="28"/>
+          <w:lang w:val="en-US"/>
+        </w:rPr>
+      </w:pPr>
+      <w:r>
+        <w:rPr>
+          <w:rFonts w:cstheme="minorHAnsi"/>
+          <w:sz w:val="28"/>
+          <w:szCs w:val="28"/>
+          <w:lang w:val="en-US"/>
+        </w:rPr>
+        <w:t xml:space="preserve">dirname =&gt; automatically takes the root path and </w:t>
+      </w:r>
+      <w:r>
+        <w:rPr>
+          <w:rFonts w:cstheme="minorHAnsi"/>
+          <w:sz w:val="28"/>
+          <w:szCs w:val="28"/>
+          <w:lang w:val="en-US"/>
+        </w:rPr>
+        <w:t>then give folder and filename</w:t>
+      </w:r>
+    </w:p>
+    <w:p>
+      <w:pPr>
+        <w:pStyle w:val="ListParagraph"/>
+        <w:shd w:val="clear" w:color="auto" w:fill="1E1E1E"/>
+        <w:spacing w:after="0" w:line="360" w:lineRule="atLeast"/>
+        <w:ind w:left="1440"/>
+        <w:rPr>
+          <w:rFonts w:ascii="Consolas" w:eastAsia="Times New Roman" w:hAnsi="Consolas" w:cs="Times New Roman"/>
+          <w:color w:val="D4D4D4"/>
+          <w:kern w:val="0"/>
+          <w:sz w:val="27"/>
+          <w:szCs w:val="27"/>
+          <w:lang w:eastAsia="en-IN"/>
+          <w14:ligatures w14:val="none"/>
+        </w:rPr>
+      </w:pPr>
+      <w:r>
+        <w:rPr>
+          <w:rFonts w:ascii="Consolas" w:eastAsia="Times New Roman" w:hAnsi="Consolas" w:cs="Times New Roman"/>
+          <w:color w:val="569CD6"/>
+          <w:kern w:val="0"/>
+          <w:sz w:val="27"/>
+          <w:szCs w:val="27"/>
+          <w:lang w:eastAsia="en-IN"/>
+          <w14:ligatures w14:val="none"/>
+        </w:rPr>
+        <w:t>const</w:t>
+      </w:r>
+      <w:r>
+        <w:rPr>
+          <w:rFonts w:ascii="Consolas" w:eastAsia="Times New Roman" w:hAnsi="Consolas" w:cs="Times New Roman"/>
+          <w:color w:val="D4D4D4"/>
+          <w:kern w:val="0"/>
+          <w:sz w:val="27"/>
+          <w:szCs w:val="27"/>
+          <w:lang w:eastAsia="en-IN"/>
+          <w14:ligatures w14:val="none"/>
+        </w:rPr>
+        <w:t xml:space="preserve"> dotenv = require(</w:t>
+      </w:r>
+      <w:r>
+        <w:rPr>
+          <w:rFonts w:ascii="Consolas" w:eastAsia="Times New Roman" w:hAnsi="Consolas" w:cs="Times New Roman"/>
+          <w:color w:val="CE9178"/>
+          <w:kern w:val="0"/>
+          <w:sz w:val="27"/>
+          <w:szCs w:val="27"/>
+          <w:lang w:eastAsia="en-IN"/>
+          <w14:ligatures w14:val="none"/>
+        </w:rPr>
+        <w:t>'dotenv'</w:t>
+      </w:r>
+      <w:r>
+        <w:rPr>
+          <w:rFonts w:ascii="Consolas" w:eastAsia="Times New Roman" w:hAnsi="Consolas" w:cs="Times New Roman"/>
+          <w:color w:val="D4D4D4"/>
+          <w:kern w:val="0"/>
+          <w:sz w:val="27"/>
+          <w:szCs w:val="27"/>
+          <w:lang w:eastAsia="en-IN"/>
+          <w14:ligatures w14:val="none"/>
+        </w:rPr>
+        <w:t>);</w:t>
+      </w:r>
+    </w:p>
+    <w:p>
+      <w:pPr>
+        <w:pStyle w:val="ListParagraph"/>
+        <w:shd w:val="clear" w:color="auto" w:fill="1E1E1E"/>
+        <w:spacing w:after="0" w:line="360" w:lineRule="atLeast"/>
+        <w:ind w:left="1440"/>
+        <w:rPr>
+          <w:rFonts w:ascii="Consolas" w:eastAsia="Times New Roman" w:hAnsi="Consolas" w:cs="Times New Roman"/>
+          <w:color w:val="D4D4D4"/>
+          <w:kern w:val="0"/>
+          <w:sz w:val="27"/>
+          <w:szCs w:val="27"/>
+          <w:lang w:eastAsia="en-IN"/>
+          <w14:ligatures w14:val="none"/>
+        </w:rPr>
+      </w:pPr>
+      <w:r>
+        <w:rPr>
+          <w:rFonts w:ascii="Consolas" w:eastAsia="Times New Roman" w:hAnsi="Consolas" w:cs="Times New Roman"/>
+          <w:color w:val="569CD6"/>
+          <w:kern w:val="0"/>
+          <w:sz w:val="27"/>
+          <w:szCs w:val="27"/>
+          <w:lang w:eastAsia="en-IN"/>
+          <w14:ligatures w14:val="none"/>
+        </w:rPr>
+        <w:t>const</w:t>
+      </w:r>
+      <w:r>
+        <w:rPr>
+          <w:rFonts w:ascii="Consolas" w:eastAsia="Times New Roman" w:hAnsi="Consolas" w:cs="Times New Roman"/>
+          <w:color w:val="D4D4D4"/>
+          <w:kern w:val="0"/>
+          <w:sz w:val="27"/>
+          <w:szCs w:val="27"/>
+          <w:lang w:eastAsia="en-IN"/>
+          <w14:ligatures w14:val="none"/>
+        </w:rPr>
+        <w:t xml:space="preserve"> path = require(</w:t>
+      </w:r>
+      <w:r>
+        <w:rPr>
+          <w:rFonts w:ascii="Consolas" w:eastAsia="Times New Roman" w:hAnsi="Consolas" w:cs="Times New Roman"/>
+          <w:color w:val="CE9178"/>
+          <w:kern w:val="0"/>
+          <w:sz w:val="27"/>
+          <w:szCs w:val="27"/>
+          <w:lang w:eastAsia="en-IN"/>
+          <w14:ligatures w14:val="none"/>
+        </w:rPr>
+        <w:t>'path'</w:t>
+      </w:r>
+      <w:r>
+        <w:rPr>
+          <w:rFonts w:ascii="Consolas" w:eastAsia="Times New Roman" w:hAnsi="Consolas" w:cs="Times New Roman"/>
+          <w:color w:val="D4D4D4"/>
+          <w:kern w:val="0"/>
+          <w:sz w:val="27"/>
+          <w:szCs w:val="27"/>
+          <w:lang w:eastAsia="en-IN"/>
+          <w14:ligatures w14:val="none"/>
+        </w:rPr>
+        <w:t>);</w:t>
+      </w:r>
+    </w:p>
+    <w:p>
+      <w:pPr>
+        <w:pStyle w:val="ListParagraph"/>
+        <w:shd w:val="clear" w:color="auto" w:fill="1E1E1E"/>
+        <w:spacing w:after="0" w:line="360" w:lineRule="atLeast"/>
+        <w:ind w:left="1440"/>
+        <w:rPr>
+          <w:rFonts w:ascii="Consolas" w:eastAsia="Times New Roman" w:hAnsi="Consolas" w:cs="Times New Roman"/>
+          <w:color w:val="D4D4D4"/>
+          <w:kern w:val="0"/>
+          <w:sz w:val="27"/>
+          <w:szCs w:val="27"/>
+          <w:lang w:eastAsia="en-IN"/>
+          <w14:ligatures w14:val="none"/>
+        </w:rPr>
+      </w:pPr>
+      <w:r>
+        <w:rPr>
+          <w:rFonts w:ascii="Consolas" w:eastAsia="Times New Roman" w:hAnsi="Consolas" w:cs="Times New Roman"/>
+          <w:color w:val="D4D4D4"/>
+          <w:kern w:val="0"/>
+          <w:sz w:val="27"/>
+          <w:szCs w:val="27"/>
+          <w:lang w:eastAsia="en-IN"/>
+          <w14:ligatures w14:val="none"/>
+        </w:rPr>
+        <w:t>dotenv.config({</w:t>
+      </w:r>
+      <w:r>
+        <w:rPr>
+          <w:rFonts w:ascii="Consolas" w:eastAsia="Times New Roman" w:hAnsi="Consolas" w:cs="Times New Roman"/>
+          <w:color w:val="CE9178"/>
+          <w:kern w:val="0"/>
+          <w:sz w:val="27"/>
+          <w:szCs w:val="27"/>
+          <w:lang w:eastAsia="en-IN"/>
+          <w14:ligatures w14:val="none"/>
+        </w:rPr>
+        <w:t>path</w:t>
+      </w:r>
+      <w:r>
+        <w:rPr>
+          <w:rFonts w:ascii="Consolas" w:eastAsia="Times New Roman" w:hAnsi="Consolas" w:cs="Times New Roman"/>
+          <w:color w:val="D4D4D4"/>
+          <w:kern w:val="0"/>
+          <w:sz w:val="27"/>
+          <w:szCs w:val="27"/>
+          <w:lang w:eastAsia="en-IN"/>
+          <w14:ligatures w14:val="none"/>
+        </w:rPr>
+        <w:t xml:space="preserve">:path.join(__dirname, </w:t>
+      </w:r>
+      <w:r>
+        <w:rPr>
+          <w:rFonts w:ascii="Consolas" w:eastAsia="Times New Roman" w:hAnsi="Consolas" w:cs="Times New Roman"/>
+          <w:color w:val="CE9178"/>
+          <w:kern w:val="0"/>
+          <w:sz w:val="27"/>
+          <w:szCs w:val="27"/>
+          <w:lang w:eastAsia="en-IN"/>
+          <w14:ligatures w14:val="none"/>
+        </w:rPr>
+        <w:t>'config'</w:t>
+      </w:r>
+      <w:r>
+        <w:rPr>
+          <w:rFonts w:ascii="Consolas" w:eastAsia="Times New Roman" w:hAnsi="Consolas" w:cs="Times New Roman"/>
+          <w:color w:val="D4D4D4"/>
+          <w:kern w:val="0"/>
+          <w:sz w:val="27"/>
+          <w:szCs w:val="27"/>
+          <w:lang w:eastAsia="en-IN"/>
+          <w14:ligatures w14:val="none"/>
+        </w:rPr>
+        <w:t xml:space="preserve">, </w:t>
+      </w:r>
+      <w:r>
+        <w:rPr>
+          <w:rFonts w:ascii="Consolas" w:eastAsia="Times New Roman" w:hAnsi="Consolas" w:cs="Times New Roman"/>
+          <w:color w:val="CE9178"/>
+          <w:kern w:val="0"/>
+          <w:sz w:val="27"/>
+          <w:szCs w:val="27"/>
+          <w:lang w:eastAsia="en-IN"/>
+          <w14:ligatures w14:val="none"/>
+        </w:rPr>
+        <w:t>'config.env'</w:t>
+      </w:r>
+      <w:r>
+        <w:rPr>
+          <w:rFonts w:ascii="Consolas" w:eastAsia="Times New Roman" w:hAnsi="Consolas" w:cs="Times New Roman"/>
+          <w:color w:val="D4D4D4"/>
+          <w:kern w:val="0"/>
+          <w:sz w:val="27"/>
+          <w:szCs w:val="27"/>
+          <w:lang w:eastAsia="en-IN"/>
+          <w14:ligatures w14:val="none"/>
+        </w:rPr>
+        <w:t>)})</w:t>
+      </w:r>
+    </w:p>
+    <w:p>
+      <w:pPr>
+        <w:pStyle w:val="ListParagraph"/>
+        <w:ind w:left="1440"/>
+        <w:rPr>
+          <w:rFonts w:cstheme="minorHAnsi"/>
+          <w:b/>
+          <w:bCs/>
+          <w:sz w:val="28"/>
+          <w:szCs w:val="28"/>
+          <w:lang w:val="en-US"/>
+        </w:rPr>
+      </w:pPr>
+    </w:p>
+    <w:p>
+      <w:pPr>
+        <w:pStyle w:val="ListParagraph"/>
+        <w:numPr>
+          <w:ilvl w:val="0"/>
+          <w:numId w:val="8"/>
+        </w:numPr>
+        <w:rPr>
+          <w:rFonts w:cstheme="minorHAnsi"/>
+          <w:b/>
+          <w:bCs/>
+          <w:sz w:val="28"/>
+          <w:szCs w:val="28"/>
+          <w:lang w:val="en-US"/>
+        </w:rPr>
+      </w:pPr>
+      <w:r>
+        <w:rPr>
+          <w:rFonts w:cstheme="minorHAnsi"/>
+          <w:sz w:val="28"/>
+          <w:szCs w:val="28"/>
+          <w:lang w:val="en-US"/>
+        </w:rPr>
+        <w:lastRenderedPageBreak/>
+        <w:t>process is available now in node to use port and node env.</w:t>
+      </w:r>
+    </w:p>
+    <w:p>
+      <w:pPr>
+        <w:pStyle w:val="ListParagraph"/>
+        <w:shd w:val="clear" w:color="auto" w:fill="1E1E1E"/>
+        <w:spacing w:after="0" w:line="360" w:lineRule="atLeast"/>
+        <w:ind w:left="1440"/>
+        <w:rPr>
+          <w:rFonts w:ascii="Consolas" w:eastAsia="Times New Roman" w:hAnsi="Consolas" w:cs="Times New Roman"/>
+          <w:color w:val="D4D4D4"/>
+          <w:kern w:val="0"/>
+          <w:sz w:val="27"/>
+          <w:szCs w:val="27"/>
+          <w:lang w:eastAsia="en-IN"/>
+          <w14:ligatures w14:val="none"/>
+        </w:rPr>
+      </w:pPr>
+      <w:r>
+        <w:rPr>
+          <w:rFonts w:ascii="Consolas" w:eastAsia="Times New Roman" w:hAnsi="Consolas" w:cs="Times New Roman"/>
+          <w:color w:val="D4D4D4"/>
+          <w:kern w:val="0"/>
+          <w:sz w:val="27"/>
+          <w:szCs w:val="27"/>
+          <w:lang w:eastAsia="en-IN"/>
+          <w14:ligatures w14:val="none"/>
+        </w:rPr>
+        <w:t>app.listen(process.env.PORT, ()</w:t>
+      </w:r>
+      <w:r>
+        <w:rPr>
+          <w:rFonts w:ascii="Consolas" w:eastAsia="Times New Roman" w:hAnsi="Consolas" w:cs="Times New Roman"/>
+          <w:color w:val="569CD6"/>
+          <w:kern w:val="0"/>
+          <w:sz w:val="27"/>
+          <w:szCs w:val="27"/>
+          <w:lang w:eastAsia="en-IN"/>
+          <w14:ligatures w14:val="none"/>
+        </w:rPr>
+        <w:t>=&gt;</w:t>
+      </w:r>
+      <w:r>
+        <w:rPr>
+          <w:rFonts w:ascii="Consolas" w:eastAsia="Times New Roman" w:hAnsi="Consolas" w:cs="Times New Roman"/>
+          <w:color w:val="D4D4D4"/>
+          <w:kern w:val="0"/>
+          <w:sz w:val="27"/>
+          <w:szCs w:val="27"/>
+          <w:lang w:eastAsia="en-IN"/>
+          <w14:ligatures w14:val="none"/>
+        </w:rPr>
+        <w:t>{</w:t>
+      </w:r>
+    </w:p>
+    <w:p>
+      <w:pPr>
+        <w:pStyle w:val="ListParagraph"/>
+        <w:shd w:val="clear" w:color="auto" w:fill="1E1E1E"/>
+        <w:spacing w:after="0" w:line="360" w:lineRule="atLeast"/>
+        <w:ind w:left="1440"/>
+        <w:rPr>
+          <w:rFonts w:ascii="Consolas" w:eastAsia="Times New Roman" w:hAnsi="Consolas" w:cs="Times New Roman"/>
+          <w:color w:val="D4D4D4"/>
+          <w:kern w:val="0"/>
+          <w:sz w:val="27"/>
+          <w:szCs w:val="27"/>
+          <w:lang w:eastAsia="en-IN"/>
+          <w14:ligatures w14:val="none"/>
+        </w:rPr>
+      </w:pPr>
+      <w:r>
+        <w:rPr>
+          <w:rFonts w:ascii="Consolas" w:eastAsia="Times New Roman" w:hAnsi="Consolas" w:cs="Times New Roman"/>
+          <w:color w:val="D4D4D4"/>
+          <w:kern w:val="0"/>
+          <w:sz w:val="27"/>
+          <w:szCs w:val="27"/>
+          <w:lang w:eastAsia="en-IN"/>
+          <w14:ligatures w14:val="none"/>
+        </w:rPr>
+        <w:t>  console.log(</w:t>
+      </w:r>
+      <w:r>
+        <w:rPr>
+          <w:rFonts w:ascii="Consolas" w:eastAsia="Times New Roman" w:hAnsi="Consolas" w:cs="Times New Roman"/>
+          <w:color w:val="CE9178"/>
+          <w:kern w:val="0"/>
+          <w:sz w:val="27"/>
+          <w:szCs w:val="27"/>
+          <w:lang w:eastAsia="en-IN"/>
+          <w14:ligatures w14:val="none"/>
+        </w:rPr>
+        <w:t>`Server listening to port ${process</w:t>
+      </w:r>
+      <w:r>
+        <w:rPr>
+          <w:rFonts w:ascii="Consolas" w:eastAsia="Times New Roman" w:hAnsi="Consolas" w:cs="Times New Roman"/>
+          <w:color w:val="D4D4D4"/>
+          <w:kern w:val="0"/>
+          <w:sz w:val="27"/>
+          <w:szCs w:val="27"/>
+          <w:lang w:eastAsia="en-IN"/>
+          <w14:ligatures w14:val="none"/>
+        </w:rPr>
+        <w:t>.</w:t>
+      </w:r>
+      <w:r>
+        <w:rPr>
+          <w:rFonts w:ascii="Consolas" w:eastAsia="Times New Roman" w:hAnsi="Consolas" w:cs="Times New Roman"/>
+          <w:color w:val="CE9178"/>
+          <w:kern w:val="0"/>
+          <w:sz w:val="27"/>
+          <w:szCs w:val="27"/>
+          <w:lang w:eastAsia="en-IN"/>
+          <w14:ligatures w14:val="none"/>
+        </w:rPr>
+        <w:t>env</w:t>
+      </w:r>
+      <w:r>
+        <w:rPr>
+          <w:rFonts w:ascii="Consolas" w:eastAsia="Times New Roman" w:hAnsi="Consolas" w:cs="Times New Roman"/>
+          <w:color w:val="D4D4D4"/>
+          <w:kern w:val="0"/>
+          <w:sz w:val="27"/>
+          <w:szCs w:val="27"/>
+          <w:lang w:eastAsia="en-IN"/>
+          <w14:ligatures w14:val="none"/>
+        </w:rPr>
+        <w:t>.</w:t>
+      </w:r>
+      <w:r>
+        <w:rPr>
+          <w:rFonts w:ascii="Consolas" w:eastAsia="Times New Roman" w:hAnsi="Consolas" w:cs="Times New Roman"/>
+          <w:color w:val="CE9178"/>
+          <w:kern w:val="0"/>
+          <w:sz w:val="27"/>
+          <w:szCs w:val="27"/>
+          <w:lang w:eastAsia="en-IN"/>
+          <w14:ligatures w14:val="none"/>
+        </w:rPr>
+        <w:t>PORT} in ${process</w:t>
+      </w:r>
+      <w:r>
+        <w:rPr>
+          <w:rFonts w:ascii="Consolas" w:eastAsia="Times New Roman" w:hAnsi="Consolas" w:cs="Times New Roman"/>
+          <w:color w:val="D4D4D4"/>
+          <w:kern w:val="0"/>
+          <w:sz w:val="27"/>
+          <w:szCs w:val="27"/>
+          <w:lang w:eastAsia="en-IN"/>
+          <w14:ligatures w14:val="none"/>
+        </w:rPr>
+        <w:t>.</w:t>
+      </w:r>
+      <w:r>
+        <w:rPr>
+          <w:rFonts w:ascii="Consolas" w:eastAsia="Times New Roman" w:hAnsi="Consolas" w:cs="Times New Roman"/>
+          <w:color w:val="CE9178"/>
+          <w:kern w:val="0"/>
+          <w:sz w:val="27"/>
+          <w:szCs w:val="27"/>
+          <w:lang w:eastAsia="en-IN"/>
+          <w14:ligatures w14:val="none"/>
+        </w:rPr>
+        <w:t>env</w:t>
+      </w:r>
+      <w:r>
+        <w:rPr>
+          <w:rFonts w:ascii="Consolas" w:eastAsia="Times New Roman" w:hAnsi="Consolas" w:cs="Times New Roman"/>
+          <w:color w:val="D4D4D4"/>
+          <w:kern w:val="0"/>
+          <w:sz w:val="27"/>
+          <w:szCs w:val="27"/>
+          <w:lang w:eastAsia="en-IN"/>
+          <w14:ligatures w14:val="none"/>
+        </w:rPr>
+        <w:t>.</w:t>
+      </w:r>
+      <w:r>
+        <w:rPr>
+          <w:rFonts w:ascii="Consolas" w:eastAsia="Times New Roman" w:hAnsi="Consolas" w:cs="Times New Roman"/>
+          <w:color w:val="CE9178"/>
+          <w:kern w:val="0"/>
+          <w:sz w:val="27"/>
+          <w:szCs w:val="27"/>
+          <w:lang w:eastAsia="en-IN"/>
+          <w14:ligatures w14:val="none"/>
+        </w:rPr>
+        <w:t>NODE_ENV}`</w:t>
+      </w:r>
+      <w:r>
+        <w:rPr>
+          <w:rFonts w:ascii="Consolas" w:eastAsia="Times New Roman" w:hAnsi="Consolas" w:cs="Times New Roman"/>
+          <w:color w:val="D4D4D4"/>
+          <w:kern w:val="0"/>
+          <w:sz w:val="27"/>
+          <w:szCs w:val="27"/>
+          <w:lang w:eastAsia="en-IN"/>
+          <w14:ligatures w14:val="none"/>
+        </w:rPr>
+        <w:t>);</w:t>
+      </w:r>
+    </w:p>
+    <w:p>
+      <w:pPr>
+        <w:pStyle w:val="ListParagraph"/>
+        <w:shd w:val="clear" w:color="auto" w:fill="1E1E1E"/>
+        <w:spacing w:after="0" w:line="360" w:lineRule="atLeast"/>
+        <w:ind w:left="1440"/>
+        <w:rPr>
+          <w:rFonts w:ascii="Consolas" w:eastAsia="Times New Roman" w:hAnsi="Consolas" w:cs="Times New Roman"/>
+          <w:color w:val="D4D4D4"/>
+          <w:kern w:val="0"/>
+          <w:sz w:val="27"/>
+          <w:szCs w:val="27"/>
+          <w:lang w:eastAsia="en-IN"/>
+          <w14:ligatures w14:val="none"/>
+        </w:rPr>
+      </w:pPr>
+      <w:r>
+        <w:rPr>
+          <w:rFonts w:ascii="Consolas" w:eastAsia="Times New Roman" w:hAnsi="Consolas" w:cs="Times New Roman"/>
+          <w:color w:val="D4D4D4"/>
+          <w:kern w:val="0"/>
+          <w:sz w:val="27"/>
+          <w:szCs w:val="27"/>
+          <w:lang w:eastAsia="en-IN"/>
+          <w14:ligatures w14:val="none"/>
+        </w:rPr>
+        <w:t>})</w:t>
+      </w:r>
+    </w:p>
+    <w:p>
+      <w:pPr>
+        <w:pStyle w:val="ListParagraph"/>
+        <w:rPr>
+          <w:rFonts w:cstheme="minorHAnsi"/>
+          <w:b/>
+          <w:bCs/>
+          <w:sz w:val="28"/>
+          <w:szCs w:val="28"/>
+          <w:lang w:val="en-US"/>
+        </w:rPr>
+      </w:pPr>
+    </w:p>
+    <w:p>
+      <w:pPr>
+        <w:pStyle w:val="ListParagraph"/>
+        <w:numPr>
+          <w:ilvl w:val="0"/>
+          <w:numId w:val="1"/>
+        </w:numPr>
+        <w:rPr>
+          <w:rFonts w:cstheme="minorHAnsi"/>
+          <w:b/>
+          <w:bCs/>
+          <w:sz w:val="28"/>
+          <w:szCs w:val="28"/>
+          <w:lang w:val="en-US"/>
+        </w:rPr>
+      </w:pPr>
+      <w:r>
+        <w:rPr>
+          <w:rFonts w:cstheme="minorHAnsi"/>
+          <w:sz w:val="28"/>
+          <w:szCs w:val="28"/>
+          <w:lang w:val="en-US"/>
+        </w:rPr>
+        <w:t>Create Routes and controllers</w:t>
+      </w:r>
+    </w:p>
+    <w:p>
+      <w:pPr>
+        <w:pStyle w:val="ListParagraph"/>
+        <w:numPr>
+          <w:ilvl w:val="1"/>
+          <w:numId w:val="1"/>
+        </w:numPr>
+        <w:rPr>
+          <w:rFonts w:cstheme="minorHAnsi"/>
+          <w:b/>
+          <w:bCs/>
+          <w:sz w:val="28"/>
+          <w:szCs w:val="28"/>
+          <w:lang w:val="en-US"/>
+        </w:rPr>
+      </w:pPr>
+      <w:r>
+        <w:rPr>
+          <w:rFonts w:cstheme="minorHAnsi"/>
+          <w:sz w:val="28"/>
+          <w:szCs w:val="28"/>
+          <w:lang w:val="en-US"/>
+        </w:rPr>
+        <w:t>To create routes created a routes folder and inside created product.js</w:t>
+      </w:r>
+    </w:p>
+    <w:p>
+      <w:pPr>
+        <w:pStyle w:val="ListParagraph"/>
+        <w:numPr>
+          <w:ilvl w:val="1"/>
+          <w:numId w:val="1"/>
+        </w:numPr>
+        <w:rPr>
+          <w:rFonts w:cstheme="minorHAnsi"/>
+          <w:b/>
+          <w:bCs/>
+          <w:sz w:val="28"/>
+          <w:szCs w:val="28"/>
           <w:lang w:val="en-US"/>
         </w:rPr>
       </w:pPr>
     </w:p>
     <w:sectPr>
-      <w:pgSz w:w="16838" w:h="11906" w:orient="landscape" w:code="9"/>
+      <w:pgSz w:w="11906" w:h="16838" w:code="9"/>
       <w:pgMar w:top="1440" w:right="1440" w:bottom="1440" w:left="1440" w:header="720" w:footer="720" w:gutter="0"/>
       <w:cols w:space="1522"/>
       <w:docGrid w:linePitch="360"/>
@@ -826,6 +1924,32 @@
 
 <file path=word/numbering.xml><?xml version="1.0" encoding="utf-8"?>
 <w:numbering xmlns:wpc="http://schemas.microsoft.com/office/word/2010/wordprocessingCanvas" xmlns:cx="http://schemas.microsoft.com/office/drawing/2014/chartex" xmlns:cx1="http://schemas.microsoft.com/office/drawing/2015/9/8/chartex" xmlns:cx2="http://schemas.microsoft.com/office/drawing/2015/10/21/chartex" xmlns:cx3="http://schemas.microsoft.com/office/drawing/2016/5/9/chartex" xmlns:cx4="http://schemas.microsoft.com/office/drawing/2016/5/10/chartex" xmlns:cx5="http://schemas.microsoft.com/office/drawing/2016/5/11/chartex" xmlns:cx6="http://schemas.microsoft.com/office/drawing/2016/5/12/chartex" xmlns:cx7="http://schemas.microsoft.com/office/drawing/2016/5/13/chartex" xmlns:cx8="http://schemas.microsoft.com/office/drawing/2016/5/14/chartex" xmlns:mc="http://schemas.openxmlformats.org/markup-compatibility/2006" xmlns:aink="http://schemas.microsoft.com/office/drawing/2016/ink" xmlns:am3d="http://schemas.microsoft.com/office/drawing/2017/model3d" xmlns:o="urn:schemas-microsoft-com:office:office" xmlns:oel="http://schemas.microsoft.com/office/2019/extlst" xmlns:r="http://schemas.openxmlformats.org/officeDocument/2006/relationships" xmlns:m="http://schemas.openxmlformats.org/officeDocument/2006/math" xmlns:v="urn:schemas-microsoft-com:vml" xmlns:wp14="http://schemas.microsoft.com/office/word/2010/wordprocessingDrawing" xmlns:wp="http://schemas.openxmlformats.org/drawingml/2006/wordprocessingDrawing" xmlns:w10="urn:schemas-microsoft-com:office:word" xmlns:w="http://schemas.openxmlformats.org/wordprocessingml/2006/main" xmlns:w14="http://schemas.microsoft.com/office/word/2010/wordml" xmlns:w15="http://schemas.microsoft.com/office/word/2012/wordml" xmlns:w16cex="http://schemas.microsoft.com/office/word/2018/wordml/cex" xmlns:w16cid="http://schemas.microsoft.com/office/word/2016/wordml/cid" xmlns:w16="http://schemas.microsoft.com/office/word/2018/wordml" xmlns:w16du="http://schemas.microsoft.com/office/word/2023/wordml/word16du" xmlns:w16sdtdh="http://schemas.microsoft.com/office/word/2020/wordml/sdtdatahash" xmlns:w16sdtfl="http://schemas.microsoft.com/office/word/2024/wordml/sdtformatlock" xmlns:w16se="http://schemas.microsoft.com/office/word/2015/wordml/symex" xmlns:wpg="http://schemas.microsoft.com/office/word/2010/wordprocessingGroup" xmlns:wpi="http://schemas.microsoft.com/office/word/2010/wordprocessingInk" xmlns:wne="http://schemas.microsoft.com/office/word/2006/wordml" xmlns:wps="http://schemas.microsoft.com/office/word/2010/wordprocessingShape" mc:Ignorable="w14 w15 w16se w16cid w16 w16cex w16sdtdh w16sdtfl w16du wp14">
+  <w:numPicBullet w:numPicBulletId="0">
+    <w:pict>
+      <v:shapetype id="_x0000_t75" coordsize="21600,21600" o:spt="75" o:preferrelative="t" path="m@4@5l@4@11@9@11@9@5xe" filled="f" stroked="f">
+        <v:stroke joinstyle="miter"/>
+        <v:formulas>
+          <v:f eqn="if lineDrawn pixelLineWidth 0"/>
+          <v:f eqn="sum @0 1 0"/>
+          <v:f eqn="sum 0 0 @1"/>
+          <v:f eqn="prod @2 1 2"/>
+          <v:f eqn="prod @3 21600 pixelWidth"/>
+          <v:f eqn="prod @3 21600 pixelHeight"/>
+          <v:f eqn="sum @0 0 1"/>
+          <v:f eqn="prod @6 1 2"/>
+          <v:f eqn="prod @7 21600 pixelWidth"/>
+          <v:f eqn="sum @8 21600 0"/>
+          <v:f eqn="prod @7 21600 pixelHeight"/>
+          <v:f eqn="sum @10 21600 0"/>
+        </v:formulas>
+        <v:path o:extrusionok="f" gradientshapeok="t" o:connecttype="rect"/>
+        <o:lock v:ext="edit" aspectratio="t"/>
+      </v:shapetype>
+      <v:shape id="_x0000_i1195" type="#_x0000_t75" style="width:11.2pt;height:11.2pt" o:bullet="t">
+        <v:imagedata r:id="rId1" o:title="mso3828"/>
+      </v:shape>
+    </w:pict>
+  </w:numPicBullet>
   <w:abstractNum w:abstractNumId="0" w15:restartNumberingAfterBreak="0">
     <w:nsid w:val="01332882"/>
     <w:multiLevelType w:val="hybridMultilevel"/>
@@ -940,9 +2064,235 @@
     </w:lvl>
   </w:abstractNum>
   <w:abstractNum w:abstractNumId="1" w15:restartNumberingAfterBreak="0">
+    <w:nsid w:val="17B52941"/>
+    <w:multiLevelType w:val="hybridMultilevel"/>
+    <w:tmpl w:val="60C264F0"/>
+    <w:lvl w:ilvl="0" w:tplc="40090005">
+      <w:start w:val="1"/>
+      <w:numFmt w:val="bullet"/>
+      <w:lvlText w:val=""/>
+      <w:lvlJc w:val="left"/>
+      <w:pPr>
+        <w:ind w:left="1440" w:hanging="360"/>
+      </w:pPr>
+      <w:rPr>
+        <w:rFonts w:ascii="Wingdings" w:hAnsi="Wingdings" w:hint="default"/>
+      </w:rPr>
+    </w:lvl>
+    <w:lvl w:ilvl="1" w:tplc="40090003" w:tentative="1">
+      <w:start w:val="1"/>
+      <w:numFmt w:val="bullet"/>
+      <w:lvlText w:val="o"/>
+      <w:lvlJc w:val="left"/>
+      <w:pPr>
+        <w:ind w:left="2160" w:hanging="360"/>
+      </w:pPr>
+      <w:rPr>
+        <w:rFonts w:ascii="Courier New" w:hAnsi="Courier New" w:cs="Courier New" w:hint="default"/>
+      </w:rPr>
+    </w:lvl>
+    <w:lvl w:ilvl="2" w:tplc="40090005" w:tentative="1">
+      <w:start w:val="1"/>
+      <w:numFmt w:val="bullet"/>
+      <w:lvlText w:val=""/>
+      <w:lvlJc w:val="left"/>
+      <w:pPr>
+        <w:ind w:left="2880" w:hanging="360"/>
+      </w:pPr>
+      <w:rPr>
+        <w:rFonts w:ascii="Wingdings" w:hAnsi="Wingdings" w:hint="default"/>
+      </w:rPr>
+    </w:lvl>
+    <w:lvl w:ilvl="3" w:tplc="40090001" w:tentative="1">
+      <w:start w:val="1"/>
+      <w:numFmt w:val="bullet"/>
+      <w:lvlText w:val=""/>
+      <w:lvlJc w:val="left"/>
+      <w:pPr>
+        <w:ind w:left="3600" w:hanging="360"/>
+      </w:pPr>
+      <w:rPr>
+        <w:rFonts w:ascii="Symbol" w:hAnsi="Symbol" w:hint="default"/>
+      </w:rPr>
+    </w:lvl>
+    <w:lvl w:ilvl="4" w:tplc="40090003" w:tentative="1">
+      <w:start w:val="1"/>
+      <w:numFmt w:val="bullet"/>
+      <w:lvlText w:val="o"/>
+      <w:lvlJc w:val="left"/>
+      <w:pPr>
+        <w:ind w:left="4320" w:hanging="360"/>
+      </w:pPr>
+      <w:rPr>
+        <w:rFonts w:ascii="Courier New" w:hAnsi="Courier New" w:cs="Courier New" w:hint="default"/>
+      </w:rPr>
+    </w:lvl>
+    <w:lvl w:ilvl="5" w:tplc="40090005" w:tentative="1">
+      <w:start w:val="1"/>
+      <w:numFmt w:val="bullet"/>
+      <w:lvlText w:val=""/>
+      <w:lvlJc w:val="left"/>
+      <w:pPr>
+        <w:ind w:left="5040" w:hanging="360"/>
+      </w:pPr>
+      <w:rPr>
+        <w:rFonts w:ascii="Wingdings" w:hAnsi="Wingdings" w:hint="default"/>
+      </w:rPr>
+    </w:lvl>
+    <w:lvl w:ilvl="6" w:tplc="40090001" w:tentative="1">
+      <w:start w:val="1"/>
+      <w:numFmt w:val="bullet"/>
+      <w:lvlText w:val=""/>
+      <w:lvlJc w:val="left"/>
+      <w:pPr>
+        <w:ind w:left="5760" w:hanging="360"/>
+      </w:pPr>
+      <w:rPr>
+        <w:rFonts w:ascii="Symbol" w:hAnsi="Symbol" w:hint="default"/>
+      </w:rPr>
+    </w:lvl>
+    <w:lvl w:ilvl="7" w:tplc="40090003" w:tentative="1">
+      <w:start w:val="1"/>
+      <w:numFmt w:val="bullet"/>
+      <w:lvlText w:val="o"/>
+      <w:lvlJc w:val="left"/>
+      <w:pPr>
+        <w:ind w:left="6480" w:hanging="360"/>
+      </w:pPr>
+      <w:rPr>
+        <w:rFonts w:ascii="Courier New" w:hAnsi="Courier New" w:cs="Courier New" w:hint="default"/>
+      </w:rPr>
+    </w:lvl>
+    <w:lvl w:ilvl="8" w:tplc="40090005" w:tentative="1">
+      <w:start w:val="1"/>
+      <w:numFmt w:val="bullet"/>
+      <w:lvlText w:val=""/>
+      <w:lvlJc w:val="left"/>
+      <w:pPr>
+        <w:ind w:left="7200" w:hanging="360"/>
+      </w:pPr>
+      <w:rPr>
+        <w:rFonts w:ascii="Wingdings" w:hAnsi="Wingdings" w:hint="default"/>
+      </w:rPr>
+    </w:lvl>
+  </w:abstractNum>
+  <w:abstractNum w:abstractNumId="2" w15:restartNumberingAfterBreak="0">
+    <w:nsid w:val="18313A2E"/>
+    <w:multiLevelType w:val="hybridMultilevel"/>
+    <w:tmpl w:val="7E94616E"/>
+    <w:lvl w:ilvl="0" w:tplc="4009000B">
+      <w:start w:val="1"/>
+      <w:numFmt w:val="bullet"/>
+      <w:lvlText w:val=""/>
+      <w:lvlJc w:val="left"/>
+      <w:pPr>
+        <w:ind w:left="1080" w:hanging="360"/>
+      </w:pPr>
+      <w:rPr>
+        <w:rFonts w:ascii="Wingdings" w:hAnsi="Wingdings" w:hint="default"/>
+      </w:rPr>
+    </w:lvl>
+    <w:lvl w:ilvl="1" w:tplc="FFFFFFFF">
+      <w:start w:val="1"/>
+      <w:numFmt w:val="bullet"/>
+      <w:lvlText w:val="o"/>
+      <w:lvlJc w:val="left"/>
+      <w:pPr>
+        <w:ind w:left="1800" w:hanging="360"/>
+      </w:pPr>
+      <w:rPr>
+        <w:rFonts w:ascii="Courier New" w:hAnsi="Courier New" w:cs="Courier New" w:hint="default"/>
+      </w:rPr>
+    </w:lvl>
+    <w:lvl w:ilvl="2" w:tplc="FFFFFFFF" w:tentative="1">
+      <w:start w:val="1"/>
+      <w:numFmt w:val="bullet"/>
+      <w:lvlText w:val=""/>
+      <w:lvlJc w:val="left"/>
+      <w:pPr>
+        <w:ind w:left="2520" w:hanging="360"/>
+      </w:pPr>
+      <w:rPr>
+        <w:rFonts w:ascii="Wingdings" w:hAnsi="Wingdings" w:hint="default"/>
+      </w:rPr>
+    </w:lvl>
+    <w:lvl w:ilvl="3" w:tplc="FFFFFFFF" w:tentative="1">
+      <w:start w:val="1"/>
+      <w:numFmt w:val="bullet"/>
+      <w:lvlText w:val=""/>
+      <w:lvlJc w:val="left"/>
+      <w:pPr>
+        <w:ind w:left="3240" w:hanging="360"/>
+      </w:pPr>
+      <w:rPr>
+        <w:rFonts w:ascii="Symbol" w:hAnsi="Symbol" w:hint="default"/>
+      </w:rPr>
+    </w:lvl>
+    <w:lvl w:ilvl="4" w:tplc="FFFFFFFF" w:tentative="1">
+      <w:start w:val="1"/>
+      <w:numFmt w:val="bullet"/>
+      <w:lvlText w:val="o"/>
+      <w:lvlJc w:val="left"/>
+      <w:pPr>
+        <w:ind w:left="3960" w:hanging="360"/>
+      </w:pPr>
+      <w:rPr>
+        <w:rFonts w:ascii="Courier New" w:hAnsi="Courier New" w:cs="Courier New" w:hint="default"/>
+      </w:rPr>
+    </w:lvl>
+    <w:lvl w:ilvl="5" w:tplc="FFFFFFFF" w:tentative="1">
+      <w:start w:val="1"/>
+      <w:numFmt w:val="bullet"/>
+      <w:lvlText w:val=""/>
+      <w:lvlJc w:val="left"/>
+      <w:pPr>
+        <w:ind w:left="4680" w:hanging="360"/>
+      </w:pPr>
+      <w:rPr>
+        <w:rFonts w:ascii="Wingdings" w:hAnsi="Wingdings" w:hint="default"/>
+      </w:rPr>
+    </w:lvl>
+    <w:lvl w:ilvl="6" w:tplc="FFFFFFFF" w:tentative="1">
+      <w:start w:val="1"/>
+      <w:numFmt w:val="bullet"/>
+      <w:lvlText w:val=""/>
+      <w:lvlJc w:val="left"/>
+      <w:pPr>
+        <w:ind w:left="5400" w:hanging="360"/>
+      </w:pPr>
+      <w:rPr>
+        <w:rFonts w:ascii="Symbol" w:hAnsi="Symbol" w:hint="default"/>
+      </w:rPr>
+    </w:lvl>
+    <w:lvl w:ilvl="7" w:tplc="FFFFFFFF" w:tentative="1">
+      <w:start w:val="1"/>
+      <w:numFmt w:val="bullet"/>
+      <w:lvlText w:val="o"/>
+      <w:lvlJc w:val="left"/>
+      <w:pPr>
+        <w:ind w:left="6120" w:hanging="360"/>
+      </w:pPr>
+      <w:rPr>
+        <w:rFonts w:ascii="Courier New" w:hAnsi="Courier New" w:cs="Courier New" w:hint="default"/>
+      </w:rPr>
+    </w:lvl>
+    <w:lvl w:ilvl="8" w:tplc="FFFFFFFF" w:tentative="1">
+      <w:start w:val="1"/>
+      <w:numFmt w:val="bullet"/>
+      <w:lvlText w:val=""/>
+      <w:lvlJc w:val="left"/>
+      <w:pPr>
+        <w:ind w:left="6840" w:hanging="360"/>
+      </w:pPr>
+      <w:rPr>
+        <w:rFonts w:ascii="Wingdings" w:hAnsi="Wingdings" w:hint="default"/>
+      </w:rPr>
+    </w:lvl>
+  </w:abstractNum>
+  <w:abstractNum w:abstractNumId="3" w15:restartNumberingAfterBreak="0">
     <w:nsid w:val="18B50E3B"/>
     <w:multiLevelType w:val="hybridMultilevel"/>
-    <w:tmpl w:val="F782E52C"/>
+    <w:tmpl w:val="8CC6017E"/>
     <w:lvl w:ilvl="0" w:tplc="40090009">
       <w:start w:val="1"/>
       <w:numFmt w:val="bullet"/>
@@ -955,104 +2305,104 @@
         <w:rFonts w:ascii="Wingdings" w:hAnsi="Wingdings" w:hint="default"/>
       </w:rPr>
     </w:lvl>
-    <w:lvl w:ilvl="1" w:tplc="40090003" w:tentative="1">
+    <w:lvl w:ilvl="1" w:tplc="40090005">
+      <w:start w:val="1"/>
+      <w:numFmt w:val="bullet"/>
+      <w:lvlText w:val=""/>
+      <w:lvlJc w:val="left"/>
+      <w:pPr>
+        <w:ind w:left="1440" w:hanging="360"/>
+      </w:pPr>
+      <w:rPr>
+        <w:rFonts w:ascii="Wingdings" w:hAnsi="Wingdings" w:hint="default"/>
+      </w:rPr>
+    </w:lvl>
+    <w:lvl w:ilvl="2" w:tplc="40090005" w:tentative="1">
+      <w:start w:val="1"/>
+      <w:numFmt w:val="bullet"/>
+      <w:lvlText w:val=""/>
+      <w:lvlJc w:val="left"/>
+      <w:pPr>
+        <w:ind w:left="2160" w:hanging="360"/>
+      </w:pPr>
+      <w:rPr>
+        <w:rFonts w:ascii="Wingdings" w:hAnsi="Wingdings" w:hint="default"/>
+      </w:rPr>
+    </w:lvl>
+    <w:lvl w:ilvl="3" w:tplc="40090001" w:tentative="1">
+      <w:start w:val="1"/>
+      <w:numFmt w:val="bullet"/>
+      <w:lvlText w:val=""/>
+      <w:lvlJc w:val="left"/>
+      <w:pPr>
+        <w:ind w:left="2880" w:hanging="360"/>
+      </w:pPr>
+      <w:rPr>
+        <w:rFonts w:ascii="Symbol" w:hAnsi="Symbol" w:hint="default"/>
+      </w:rPr>
+    </w:lvl>
+    <w:lvl w:ilvl="4" w:tplc="40090003" w:tentative="1">
       <w:start w:val="1"/>
       <w:numFmt w:val="bullet"/>
       <w:lvlText w:val="o"/>
       <w:lvlJc w:val="left"/>
       <w:pPr>
-        <w:ind w:left="1440" w:hanging="360"/>
+        <w:ind w:left="3600" w:hanging="360"/>
       </w:pPr>
       <w:rPr>
         <w:rFonts w:ascii="Courier New" w:hAnsi="Courier New" w:cs="Courier New" w:hint="default"/>
       </w:rPr>
     </w:lvl>
-    <w:lvl w:ilvl="2" w:tplc="40090005" w:tentative="1">
+    <w:lvl w:ilvl="5" w:tplc="40090005" w:tentative="1">
       <w:start w:val="1"/>
       <w:numFmt w:val="bullet"/>
       <w:lvlText w:val=""/>
       <w:lvlJc w:val="left"/>
       <w:pPr>
-        <w:ind w:left="2160" w:hanging="360"/>
+        <w:ind w:left="4320" w:hanging="360"/>
       </w:pPr>
       <w:rPr>
         <w:rFonts w:ascii="Wingdings" w:hAnsi="Wingdings" w:hint="default"/>
       </w:rPr>
     </w:lvl>
-    <w:lvl w:ilvl="3" w:tplc="40090001" w:tentative="1">
+    <w:lvl w:ilvl="6" w:tplc="40090001" w:tentative="1">
       <w:start w:val="1"/>
       <w:numFmt w:val="bullet"/>
       <w:lvlText w:val=""/>
       <w:lvlJc w:val="left"/>
       <w:pPr>
-        <w:ind w:left="2880" w:hanging="360"/>
+        <w:ind w:left="5040" w:hanging="360"/>
       </w:pPr>
       <w:rPr>
         <w:rFonts w:ascii="Symbol" w:hAnsi="Symbol" w:hint="default"/>
       </w:rPr>
     </w:lvl>
-    <w:lvl w:ilvl="4" w:tplc="40090003" w:tentative="1">
+    <w:lvl w:ilvl="7" w:tplc="40090003" w:tentative="1">
       <w:start w:val="1"/>
       <w:numFmt w:val="bullet"/>
       <w:lvlText w:val="o"/>
       <w:lvlJc w:val="left"/>
       <w:pPr>
-        <w:ind w:left="3600" w:hanging="360"/>
+        <w:ind w:left="5760" w:hanging="360"/>
       </w:pPr>
       <w:rPr>
         <w:rFonts w:ascii="Courier New" w:hAnsi="Courier New" w:cs="Courier New" w:hint="default"/>
       </w:rPr>
     </w:lvl>
-    <w:lvl w:ilvl="5" w:tplc="40090005" w:tentative="1">
+    <w:lvl w:ilvl="8" w:tplc="40090005" w:tentative="1">
       <w:start w:val="1"/>
       <w:numFmt w:val="bullet"/>
       <w:lvlText w:val=""/>
       <w:lvlJc w:val="left"/>
       <w:pPr>
-        <w:ind w:left="4320" w:hanging="360"/>
+        <w:ind w:left="6480" w:hanging="360"/>
       </w:pPr>
       <w:rPr>
         <w:rFonts w:ascii="Wingdings" w:hAnsi="Wingdings" w:hint="default"/>
       </w:rPr>
     </w:lvl>
-    <w:lvl w:ilvl="6" w:tplc="40090001" w:tentative="1">
-      <w:start w:val="1"/>
-      <w:numFmt w:val="bullet"/>
-      <w:lvlText w:val=""/>
-      <w:lvlJc w:val="left"/>
-      <w:pPr>
-        <w:ind w:left="5040" w:hanging="360"/>
-      </w:pPr>
-      <w:rPr>
-        <w:rFonts w:ascii="Symbol" w:hAnsi="Symbol" w:hint="default"/>
-      </w:rPr>
-    </w:lvl>
-    <w:lvl w:ilvl="7" w:tplc="40090003" w:tentative="1">
-      <w:start w:val="1"/>
-      <w:numFmt w:val="bullet"/>
-      <w:lvlText w:val="o"/>
-      <w:lvlJc w:val="left"/>
-      <w:pPr>
-        <w:ind w:left="5760" w:hanging="360"/>
-      </w:pPr>
-      <w:rPr>
-        <w:rFonts w:ascii="Courier New" w:hAnsi="Courier New" w:cs="Courier New" w:hint="default"/>
-      </w:rPr>
-    </w:lvl>
-    <w:lvl w:ilvl="8" w:tplc="40090005" w:tentative="1">
-      <w:start w:val="1"/>
-      <w:numFmt w:val="bullet"/>
-      <w:lvlText w:val=""/>
-      <w:lvlJc w:val="left"/>
-      <w:pPr>
-        <w:ind w:left="6480" w:hanging="360"/>
-      </w:pPr>
-      <w:rPr>
-        <w:rFonts w:ascii="Wingdings" w:hAnsi="Wingdings" w:hint="default"/>
-      </w:rPr>
-    </w:lvl>
   </w:abstractNum>
-  <w:abstractNum w:abstractNumId="2" w15:restartNumberingAfterBreak="0">
+  <w:abstractNum w:abstractNumId="4" w15:restartNumberingAfterBreak="0">
     <w:nsid w:val="211736A8"/>
     <w:multiLevelType w:val="hybridMultilevel"/>
     <w:tmpl w:val="F8021B72"/>
@@ -1165,10 +2515,124 @@
       </w:rPr>
     </w:lvl>
   </w:abstractNum>
-  <w:abstractNum w:abstractNumId="3" w15:restartNumberingAfterBreak="0">
+  <w:abstractNum w:abstractNumId="5" w15:restartNumberingAfterBreak="0">
+    <w:nsid w:val="3FEE4E26"/>
+    <w:multiLevelType w:val="hybridMultilevel"/>
+    <w:tmpl w:val="92D44B2C"/>
+    <w:lvl w:ilvl="0" w:tplc="40090007">
+      <w:start w:val="1"/>
+      <w:numFmt w:val="bullet"/>
+      <w:lvlText w:val=""/>
+      <w:lvlPicBulletId w:val="0"/>
+      <w:lvlJc w:val="left"/>
+      <w:pPr>
+        <w:ind w:left="720" w:hanging="360"/>
+      </w:pPr>
+      <w:rPr>
+        <w:rFonts w:ascii="Symbol" w:hAnsi="Symbol" w:hint="default"/>
+      </w:rPr>
+    </w:lvl>
+    <w:lvl w:ilvl="1" w:tplc="40090003">
+      <w:start w:val="1"/>
+      <w:numFmt w:val="bullet"/>
+      <w:lvlText w:val="o"/>
+      <w:lvlJc w:val="left"/>
+      <w:pPr>
+        <w:ind w:left="1440" w:hanging="360"/>
+      </w:pPr>
+      <w:rPr>
+        <w:rFonts w:ascii="Courier New" w:hAnsi="Courier New" w:cs="Courier New" w:hint="default"/>
+      </w:rPr>
+    </w:lvl>
+    <w:lvl w:ilvl="2" w:tplc="40090005" w:tentative="1">
+      <w:start w:val="1"/>
+      <w:numFmt w:val="bullet"/>
+      <w:lvlText w:val=""/>
+      <w:lvlJc w:val="left"/>
+      <w:pPr>
+        <w:ind w:left="2160" w:hanging="360"/>
+      </w:pPr>
+      <w:rPr>
+        <w:rFonts w:ascii="Wingdings" w:hAnsi="Wingdings" w:hint="default"/>
+      </w:rPr>
+    </w:lvl>
+    <w:lvl w:ilvl="3" w:tplc="40090001" w:tentative="1">
+      <w:start w:val="1"/>
+      <w:numFmt w:val="bullet"/>
+      <w:lvlText w:val=""/>
+      <w:lvlJc w:val="left"/>
+      <w:pPr>
+        <w:ind w:left="2880" w:hanging="360"/>
+      </w:pPr>
+      <w:rPr>
+        <w:rFonts w:ascii="Symbol" w:hAnsi="Symbol" w:hint="default"/>
+      </w:rPr>
+    </w:lvl>
+    <w:lvl w:ilvl="4" w:tplc="40090003" w:tentative="1">
+      <w:start w:val="1"/>
+      <w:numFmt w:val="bullet"/>
+      <w:lvlText w:val="o"/>
+      <w:lvlJc w:val="left"/>
+      <w:pPr>
+        <w:ind w:left="3600" w:hanging="360"/>
+      </w:pPr>
+      <w:rPr>
+        <w:rFonts w:ascii="Courier New" w:hAnsi="Courier New" w:cs="Courier New" w:hint="default"/>
+      </w:rPr>
+    </w:lvl>
+    <w:lvl w:ilvl="5" w:tplc="40090005" w:tentative="1">
+      <w:start w:val="1"/>
+      <w:numFmt w:val="bullet"/>
+      <w:lvlText w:val=""/>
+      <w:lvlJc w:val="left"/>
+      <w:pPr>
+        <w:ind w:left="4320" w:hanging="360"/>
+      </w:pPr>
+      <w:rPr>
+        <w:rFonts w:ascii="Wingdings" w:hAnsi="Wingdings" w:hint="default"/>
+      </w:rPr>
+    </w:lvl>
+    <w:lvl w:ilvl="6" w:tplc="40090001" w:tentative="1">
+      <w:start w:val="1"/>
+      <w:numFmt w:val="bullet"/>
+      <w:lvlText w:val=""/>
+      <w:lvlJc w:val="left"/>
+      <w:pPr>
+        <w:ind w:left="5040" w:hanging="360"/>
+      </w:pPr>
+      <w:rPr>
+        <w:rFonts w:ascii="Symbol" w:hAnsi="Symbol" w:hint="default"/>
+      </w:rPr>
+    </w:lvl>
+    <w:lvl w:ilvl="7" w:tplc="40090003" w:tentative="1">
+      <w:start w:val="1"/>
+      <w:numFmt w:val="bullet"/>
+      <w:lvlText w:val="o"/>
+      <w:lvlJc w:val="left"/>
+      <w:pPr>
+        <w:ind w:left="5760" w:hanging="360"/>
+      </w:pPr>
+      <w:rPr>
+        <w:rFonts w:ascii="Courier New" w:hAnsi="Courier New" w:cs="Courier New" w:hint="default"/>
+      </w:rPr>
+    </w:lvl>
+    <w:lvl w:ilvl="8" w:tplc="40090005" w:tentative="1">
+      <w:start w:val="1"/>
+      <w:numFmt w:val="bullet"/>
+      <w:lvlText w:val=""/>
+      <w:lvlJc w:val="left"/>
+      <w:pPr>
+        <w:ind w:left="6480" w:hanging="360"/>
+      </w:pPr>
+      <w:rPr>
+        <w:rFonts w:ascii="Wingdings" w:hAnsi="Wingdings" w:hint="default"/>
+      </w:rPr>
+    </w:lvl>
+  </w:abstractNum>
+  <w:abstractNum w:abstractNumId="6" w15:restartNumberingAfterBreak="0">
     <w:nsid w:val="622A4028"/>
     <w:multiLevelType w:val="hybridMultilevel"/>
-    <w:tmpl w:val="F9BC4AFE"/>
+    <w:tmpl w:val="23EC7072"/>
     <w:lvl w:ilvl="0" w:tplc="4009000B">
       <w:start w:val="1"/>
       <w:numFmt w:val="bullet"/>
@@ -1181,97 +2645,210 @@
         <w:rFonts w:ascii="Wingdings" w:hAnsi="Wingdings" w:hint="default"/>
       </w:rPr>
     </w:lvl>
-    <w:lvl w:ilvl="1" w:tplc="40090003" w:tentative="1">
+    <w:lvl w:ilvl="1" w:tplc="1F741D72">
+      <w:numFmt w:val="bullet"/>
+      <w:lvlText w:val=""/>
+      <w:lvlJc w:val="left"/>
+      <w:pPr>
+        <w:ind w:left="2520" w:hanging="360"/>
+      </w:pPr>
+      <w:rPr>
+        <w:rFonts w:ascii="Wingdings" w:eastAsiaTheme="minorHAnsi" w:hAnsi="Wingdings" w:cstheme="minorHAnsi" w:hint="default"/>
+        <w:b w:val="0"/>
+      </w:rPr>
+    </w:lvl>
+    <w:lvl w:ilvl="2" w:tplc="40090005">
+      <w:start w:val="1"/>
+      <w:numFmt w:val="bullet"/>
+      <w:lvlText w:val=""/>
+      <w:lvlJc w:val="left"/>
+      <w:pPr>
+        <w:ind w:left="3240" w:hanging="360"/>
+      </w:pPr>
+      <w:rPr>
+        <w:rFonts w:ascii="Wingdings" w:hAnsi="Wingdings" w:hint="default"/>
+      </w:rPr>
+    </w:lvl>
+    <w:lvl w:ilvl="3" w:tplc="40090001" w:tentative="1">
+      <w:start w:val="1"/>
+      <w:numFmt w:val="bullet"/>
+      <w:lvlText w:val=""/>
+      <w:lvlJc w:val="left"/>
+      <w:pPr>
+        <w:ind w:left="3960" w:hanging="360"/>
+      </w:pPr>
+      <w:rPr>
+        <w:rFonts w:ascii="Symbol" w:hAnsi="Symbol" w:hint="default"/>
+      </w:rPr>
+    </w:lvl>
+    <w:lvl w:ilvl="4" w:tplc="40090003" w:tentative="1">
       <w:start w:val="1"/>
       <w:numFmt w:val="bullet"/>
       <w:lvlText w:val="o"/>
       <w:lvlJc w:val="left"/>
       <w:pPr>
+        <w:ind w:left="4680" w:hanging="360"/>
+      </w:pPr>
+      <w:rPr>
+        <w:rFonts w:ascii="Courier New" w:hAnsi="Courier New" w:cs="Courier New" w:hint="default"/>
+      </w:rPr>
+    </w:lvl>
+    <w:lvl w:ilvl="5" w:tplc="40090005" w:tentative="1">
+      <w:start w:val="1"/>
+      <w:numFmt w:val="bullet"/>
+      <w:lvlText w:val=""/>
+      <w:lvlJc w:val="left"/>
+      <w:pPr>
+        <w:ind w:left="5400" w:hanging="360"/>
+      </w:pPr>
+      <w:rPr>
+        <w:rFonts w:ascii="Wingdings" w:hAnsi="Wingdings" w:hint="default"/>
+      </w:rPr>
+    </w:lvl>
+    <w:lvl w:ilvl="6" w:tplc="40090001" w:tentative="1">
+      <w:start w:val="1"/>
+      <w:numFmt w:val="bullet"/>
+      <w:lvlText w:val=""/>
+      <w:lvlJc w:val="left"/>
+      <w:pPr>
+        <w:ind w:left="6120" w:hanging="360"/>
+      </w:pPr>
+      <w:rPr>
+        <w:rFonts w:ascii="Symbol" w:hAnsi="Symbol" w:hint="default"/>
+      </w:rPr>
+    </w:lvl>
+    <w:lvl w:ilvl="7" w:tplc="40090003" w:tentative="1">
+      <w:start w:val="1"/>
+      <w:numFmt w:val="bullet"/>
+      <w:lvlText w:val="o"/>
+      <w:lvlJc w:val="left"/>
+      <w:pPr>
+        <w:ind w:left="6840" w:hanging="360"/>
+      </w:pPr>
+      <w:rPr>
+        <w:rFonts w:ascii="Courier New" w:hAnsi="Courier New" w:cs="Courier New" w:hint="default"/>
+      </w:rPr>
+    </w:lvl>
+    <w:lvl w:ilvl="8" w:tplc="40090005" w:tentative="1">
+      <w:start w:val="1"/>
+      <w:numFmt w:val="bullet"/>
+      <w:lvlText w:val=""/>
+      <w:lvlJc w:val="left"/>
+      <w:pPr>
+        <w:ind w:left="7560" w:hanging="360"/>
+      </w:pPr>
+      <w:rPr>
+        <w:rFonts w:ascii="Wingdings" w:hAnsi="Wingdings" w:hint="default"/>
+      </w:rPr>
+    </w:lvl>
+  </w:abstractNum>
+  <w:abstractNum w:abstractNumId="7" w15:restartNumberingAfterBreak="0">
+    <w:nsid w:val="65E25983"/>
+    <w:multiLevelType w:val="hybridMultilevel"/>
+    <w:tmpl w:val="60C854C0"/>
+    <w:lvl w:ilvl="0" w:tplc="4009000B">
+      <w:start w:val="1"/>
+      <w:numFmt w:val="bullet"/>
+      <w:lvlText w:val=""/>
+      <w:lvlJc w:val="left"/>
+      <w:pPr>
+        <w:ind w:left="1080" w:hanging="360"/>
+      </w:pPr>
+      <w:rPr>
+        <w:rFonts w:ascii="Wingdings" w:hAnsi="Wingdings" w:hint="default"/>
+      </w:rPr>
+    </w:lvl>
+    <w:lvl w:ilvl="1" w:tplc="FFFFFFFF">
+      <w:start w:val="1"/>
+      <w:numFmt w:val="bullet"/>
+      <w:lvlText w:val="o"/>
+      <w:lvlJc w:val="left"/>
+      <w:pPr>
+        <w:ind w:left="1800" w:hanging="360"/>
+      </w:pPr>
+      <w:rPr>
+        <w:rFonts w:ascii="Courier New" w:hAnsi="Courier New" w:cs="Courier New" w:hint="default"/>
+      </w:rPr>
+    </w:lvl>
+    <w:lvl w:ilvl="2" w:tplc="FFFFFFFF" w:tentative="1">
+      <w:start w:val="1"/>
+      <w:numFmt w:val="bullet"/>
+      <w:lvlText w:val=""/>
+      <w:lvlJc w:val="left"/>
+      <w:pPr>
         <w:ind w:left="2520" w:hanging="360"/>
       </w:pPr>
       <w:rPr>
+        <w:rFonts w:ascii="Wingdings" w:hAnsi="Wingdings" w:hint="default"/>
+      </w:rPr>
+    </w:lvl>
+    <w:lvl w:ilvl="3" w:tplc="FFFFFFFF" w:tentative="1">
+      <w:start w:val="1"/>
+      <w:numFmt w:val="bullet"/>
+      <w:lvlText w:val=""/>
+      <w:lvlJc w:val="left"/>
+      <w:pPr>
+        <w:ind w:left="3240" w:hanging="360"/>
+      </w:pPr>
+      <w:rPr>
+        <w:rFonts w:ascii="Symbol" w:hAnsi="Symbol" w:hint="default"/>
+      </w:rPr>
+    </w:lvl>
+    <w:lvl w:ilvl="4" w:tplc="FFFFFFFF" w:tentative="1">
+      <w:start w:val="1"/>
+      <w:numFmt w:val="bullet"/>
+      <w:lvlText w:val="o"/>
+      <w:lvlJc w:val="left"/>
+      <w:pPr>
+        <w:ind w:left="3960" w:hanging="360"/>
+      </w:pPr>
+      <w:rPr>
         <w:rFonts w:ascii="Courier New" w:hAnsi="Courier New" w:cs="Courier New" w:hint="default"/>
       </w:rPr>
     </w:lvl>
-    <w:lvl w:ilvl="2" w:tplc="40090005">
+    <w:lvl w:ilvl="5" w:tplc="FFFFFFFF" w:tentative="1">
       <w:start w:val="1"/>
       <w:numFmt w:val="bullet"/>
       <w:lvlText w:val=""/>
       <w:lvlJc w:val="left"/>
       <w:pPr>
-        <w:ind w:left="3240" w:hanging="360"/>
+        <w:ind w:left="4680" w:hanging="360"/>
       </w:pPr>
       <w:rPr>
         <w:rFonts w:ascii="Wingdings" w:hAnsi="Wingdings" w:hint="default"/>
       </w:rPr>
     </w:lvl>
-    <w:lvl w:ilvl="3" w:tplc="40090001" w:tentative="1">
+    <w:lvl w:ilvl="6" w:tplc="FFFFFFFF" w:tentative="1">
       <w:start w:val="1"/>
       <w:numFmt w:val="bullet"/>
       <w:lvlText w:val=""/>
       <w:lvlJc w:val="left"/>
       <w:pPr>
-        <w:ind w:left="3960" w:hanging="360"/>
+        <w:ind w:left="5400" w:hanging="360"/>
       </w:pPr>
       <w:rPr>
         <w:rFonts w:ascii="Symbol" w:hAnsi="Symbol" w:hint="default"/>
       </w:rPr>
     </w:lvl>
-    <w:lvl w:ilvl="4" w:tplc="40090003" w:tentative="1">
+    <w:lvl w:ilvl="7" w:tplc="FFFFFFFF" w:tentative="1">
       <w:start w:val="1"/>
       <w:numFmt w:val="bullet"/>
       <w:lvlText w:val="o"/>
       <w:lvlJc w:val="left"/>
       <w:pPr>
-        <w:ind w:left="4680" w:hanging="360"/>
+        <w:ind w:left="6120" w:hanging="360"/>
       </w:pPr>
       <w:rPr>
         <w:rFonts w:ascii="Courier New" w:hAnsi="Courier New" w:cs="Courier New" w:hint="default"/>
       </w:rPr>
     </w:lvl>
-    <w:lvl w:ilvl="5" w:tplc="40090005" w:tentative="1">
+    <w:lvl w:ilvl="8" w:tplc="FFFFFFFF" w:tentative="1">
       <w:start w:val="1"/>
       <w:numFmt w:val="bullet"/>
       <w:lvlText w:val=""/>
       <w:lvlJc w:val="left"/>
       <w:pPr>
-        <w:ind w:left="5400" w:hanging="360"/>
-      </w:pPr>
-      <w:rPr>
-        <w:rFonts w:ascii="Wingdings" w:hAnsi="Wingdings" w:hint="default"/>
-      </w:rPr>
-    </w:lvl>
-    <w:lvl w:ilvl="6" w:tplc="40090001" w:tentative="1">
-      <w:start w:val="1"/>
-      <w:numFmt w:val="bullet"/>
-      <w:lvlText w:val=""/>
-      <w:lvlJc w:val="left"/>
-      <w:pPr>
-        <w:ind w:left="6120" w:hanging="360"/>
-      </w:pPr>
-      <w:rPr>
-        <w:rFonts w:ascii="Symbol" w:hAnsi="Symbol" w:hint="default"/>
-      </w:rPr>
-    </w:lvl>
-    <w:lvl w:ilvl="7" w:tplc="40090003" w:tentative="1">
-      <w:start w:val="1"/>
-      <w:numFmt w:val="bullet"/>
-      <w:lvlText w:val="o"/>
-      <w:lvlJc w:val="left"/>
-      <w:pPr>
         <w:ind w:left="6840" w:hanging="360"/>
-      </w:pPr>
-      <w:rPr>
-        <w:rFonts w:ascii="Courier New" w:hAnsi="Courier New" w:cs="Courier New" w:hint="default"/>
-      </w:rPr>
-    </w:lvl>
-    <w:lvl w:ilvl="8" w:tplc="40090005" w:tentative="1">
-      <w:start w:val="1"/>
-      <w:numFmt w:val="bullet"/>
-      <w:lvlText w:val=""/>
-      <w:lvlJc w:val="left"/>
-      <w:pPr>
-        <w:ind w:left="7560" w:hanging="360"/>
       </w:pPr>
       <w:rPr>
         <w:rFonts w:ascii="Wingdings" w:hAnsi="Wingdings" w:hint="default"/>
@@ -1279,16 +2856,28 @@
     </w:lvl>
   </w:abstractNum>
   <w:num w:numId="1" w16cid:durableId="378668122">
-    <w:abstractNumId w:val="1"/>
+    <w:abstractNumId w:val="3"/>
   </w:num>
   <w:num w:numId="2" w16cid:durableId="991636700">
     <w:abstractNumId w:val="0"/>
   </w:num>
   <w:num w:numId="3" w16cid:durableId="82530948">
-    <w:abstractNumId w:val="3"/>
+    <w:abstractNumId w:val="6"/>
   </w:num>
   <w:num w:numId="4" w16cid:durableId="1791315700">
+    <w:abstractNumId w:val="4"/>
+  </w:num>
+  <w:num w:numId="5" w16cid:durableId="1158300100">
+    <w:abstractNumId w:val="5"/>
+  </w:num>
+  <w:num w:numId="6" w16cid:durableId="771558841">
+    <w:abstractNumId w:val="7"/>
+  </w:num>
+  <w:num w:numId="7" w16cid:durableId="1153371064">
     <w:abstractNumId w:val="2"/>
+  </w:num>
+  <w:num w:numId="8" w16cid:durableId="1928344779">
+    <w:abstractNumId w:val="1"/>
   </w:num>
 </w:numbering>
 </file>
@@ -1895,7 +3484,6 @@
   <w:style w:type="character" w:default="1" w:styleId="DefaultParagraphFont">
     <w:name w:val="Default Paragraph Font"/>
     <w:uiPriority w:val="1"/>
-    <w:semiHidden/>
     <w:unhideWhenUsed/>
   </w:style>
   <w:style w:type="table" w:default="1" w:styleId="TableNormal">

</xml_diff>